<commit_message>
Add advanced quiz examples and handbook support
</commit_message>
<xml_diff>
--- a/imports/courses/outbreak_ve_demo/docx/01_vaccine_effectiveness_outbreak.docx
+++ b/imports/courses/outbreak_ve_demo/docx/01_vaccine_effectiveness_outbreak.docx
@@ -1,6 +1,6 @@
 
 <file path=word/document.xml><?xml version="1.0" encoding="utf-8"?>
-<w:document xmlns:wpc="http://schemas.microsoft.com/office/word/2010/wordprocessingCanvas" xmlns:cx="http://schemas.microsoft.com/office/drawing/2014/chartex" xmlns:cx1="http://schemas.microsoft.com/office/drawing/2015/9/8/chartex" xmlns:cx2="http://schemas.microsoft.com/office/drawing/2015/10/21/chartex" xmlns:cx3="http://schemas.microsoft.com/office/drawing/2016/5/9/chartex" xmlns:cx4="http://schemas.microsoft.com/office/drawing/2016/5/10/chartex" xmlns:cx5="http://schemas.microsoft.com/office/drawing/2016/5/11/chartex" xmlns:cx6="http://schemas.microsoft.com/office/drawing/2016/5/12/chartex" xmlns:cx7="http://schemas.microsoft.com/office/drawing/2016/5/13/chartex" xmlns:cx8="http://schemas.microsoft.com/office/drawing/2016/5/14/chartex" xmlns:mc="http://schemas.openxmlformats.org/markup-compatibility/2006" xmlns:aink="http://schemas.microsoft.com/office/drawing/2016/ink" xmlns:am3d="http://schemas.microsoft.com/office/drawing/2017/model3d" xmlns:o="urn:schemas-microsoft-com:office:office" xmlns:oel="http://schemas.microsoft.com/office/2019/extlst" xmlns:r="http://schemas.openxmlformats.org/officeDocument/2006/relationships" xmlns:m="http://schemas.openxmlformats.org/officeDocument/2006/math" xmlns:v="urn:schemas-microsoft-com:vml" xmlns:wp14="http://schemas.microsoft.com/office/word/2010/wordprocessingDrawing" xmlns:wp="http://schemas.openxmlformats.org/drawingml/2006/wordprocessingDrawing" xmlns:w10="urn:schemas-microsoft-com:office:word" xmlns:w="http://schemas.openxmlformats.org/wordprocessingml/2006/main" xmlns:w14="http://schemas.microsoft.com/office/word/2010/wordml" xmlns:w15="http://schemas.microsoft.com/office/word/2012/wordml" xmlns:w16cex="http://schemas.microsoft.com/office/word/2018/wordml/cex" xmlns:w16cid="http://schemas.microsoft.com/office/word/2016/wordml/cid" xmlns:w16="http://schemas.microsoft.com/office/word/2018/wordml" xmlns:w16du="http://schemas.microsoft.com/office/word/2023/wordml/word16du" xmlns:w16sdtdh="http://schemas.microsoft.com/office/word/2020/wordml/sdtdatahash" xmlns:w16se="http://schemas.microsoft.com/office/word/2015/wordml/symex" xmlns:wpg="http://schemas.microsoft.com/office/word/2010/wordprocessingGroup" xmlns:wpi="http://schemas.microsoft.com/office/word/2010/wordprocessingInk" xmlns:wne="http://schemas.microsoft.com/office/word/2006/wordml" xmlns:wps="http://schemas.microsoft.com/office/word/2010/wordprocessingShape" mc:Ignorable="w14 w15 w16se w16cid w16 w16cex w16sdtdh w16du wp14">
+<w:document xmlns:wpc="http://schemas.microsoft.com/office/word/2010/wordprocessingCanvas" xmlns:cx="http://schemas.microsoft.com/office/drawing/2014/chartex" xmlns:cx1="http://schemas.microsoft.com/office/drawing/2015/9/8/chartex" xmlns:cx2="http://schemas.microsoft.com/office/drawing/2015/10/21/chartex" xmlns:cx3="http://schemas.microsoft.com/office/drawing/2016/5/9/chartex" xmlns:cx4="http://schemas.microsoft.com/office/drawing/2016/5/10/chartex" xmlns:cx5="http://schemas.microsoft.com/office/drawing/2016/5/11/chartex" xmlns:cx6="http://schemas.microsoft.com/office/drawing/2016/5/12/chartex" xmlns:cx7="http://schemas.microsoft.com/office/drawing/2016/5/13/chartex" xmlns:cx8="http://schemas.microsoft.com/office/drawing/2016/5/14/chartex" xmlns:mc="http://schemas.openxmlformats.org/markup-compatibility/2006" xmlns:m="http://schemas.openxmlformats.org/officeDocument/2006/math" xmlns:aink="http://schemas.microsoft.com/office/drawing/2016/ink" xmlns:am3d="http://schemas.microsoft.com/office/drawing/2017/model3d" xmlns:oel="http://schemas.microsoft.com/office/2019/extlst" xmlns:r="http://schemas.openxmlformats.org/officeDocument/2006/relationships" xmlns:wp14="http://schemas.microsoft.com/office/word/2010/wordprocessingDrawing" xmlns:wp="http://schemas.openxmlformats.org/drawingml/2006/wordprocessingDrawing" xmlns:wpg="http://schemas.microsoft.com/office/word/2010/wordprocessingGroup" xmlns:wpi="http://schemas.microsoft.com/office/word/2010/wordprocessingInk" xmlns:wps="http://schemas.microsoft.com/office/word/2010/wordprocessingShape" xmlns:o="urn:schemas-microsoft-com:office:office" xmlns:v="urn:schemas-microsoft-com:vml" xmlns:w10="urn:schemas-microsoft-com:office:word" xmlns:w="http://schemas.openxmlformats.org/wordprocessingml/2006/main" xmlns:w14="http://schemas.microsoft.com/office/word/2010/wordml" xmlns:w15="http://schemas.microsoft.com/office/word/2012/wordml" xmlns:w16cei="http://schemas.microsoft.com/office/word/2026/wordml/cei" xmlns:w16cex="http://schemas.microsoft.com/office/word/2018/wordml/cex" xmlns:w16cid="http://schemas.microsoft.com/office/word/2016/wordml/cid" xmlns:w16="http://schemas.microsoft.com/office/word/2018/wordml" xmlns:w16sdtdh="http://schemas.microsoft.com/office/word/2020/wordml/sdtdatahash" xmlns:w16sdtfl="http://schemas.microsoft.com/office/word/2024/wordml/sdtformatlock" xmlns:w16se="http://schemas.microsoft.com/office/word/2015/wordml/symex" xmlns:w16du="http://schemas.microsoft.com/office/word/2023/wordml/word16du" xmlns:wne="http://schemas.microsoft.com/office/word/2006/wordml" mc:Ignorable="w14 w15 w16se w16cid w16 w16cex w16sdtdh w16sdtfl w16du wp14">
   <w:body>
     <w:p>
       <w:pPr>
@@ -67,7 +67,7 @@
       <w:pPr>
         <w:numPr>
           <w:ilvl w:val="0"/>
-          <w:numId w:val="4"/>
+          <w:numId w:val="2"/>
         </w:numPr>
         <w:rPr>
           <w:rFonts w:ascii="Calibri" w:hAnsi="Calibri" w:cs="Calibri"/>
@@ -84,7 +84,7 @@
       <w:pPr>
         <w:numPr>
           <w:ilvl w:val="0"/>
-          <w:numId w:val="4"/>
+          <w:numId w:val="2"/>
         </w:numPr>
         <w:rPr>
           <w:rFonts w:ascii="Calibri" w:hAnsi="Calibri" w:cs="Calibri"/>
@@ -101,7 +101,7 @@
       <w:pPr>
         <w:numPr>
           <w:ilvl w:val="0"/>
-          <w:numId w:val="4"/>
+          <w:numId w:val="2"/>
         </w:numPr>
         <w:rPr>
           <w:rFonts w:ascii="Calibri" w:hAnsi="Calibri" w:cs="Calibri"/>
@@ -118,7 +118,7 @@
       <w:pPr>
         <w:numPr>
           <w:ilvl w:val="0"/>
-          <w:numId w:val="4"/>
+          <w:numId w:val="2"/>
         </w:numPr>
         <w:rPr>
           <w:rFonts w:ascii="Calibri" w:hAnsi="Calibri" w:cs="Calibri"/>
@@ -238,7 +238,7 @@
       <w:pPr>
         <w:numPr>
           <w:ilvl w:val="0"/>
-          <w:numId w:val="5"/>
+          <w:numId w:val="3"/>
         </w:numPr>
         <w:rPr>
           <w:rFonts w:ascii="Calibri" w:hAnsi="Calibri" w:cs="Calibri"/>
@@ -255,7 +255,7 @@
       <w:pPr>
         <w:numPr>
           <w:ilvl w:val="0"/>
-          <w:numId w:val="5"/>
+          <w:numId w:val="3"/>
         </w:numPr>
         <w:rPr>
           <w:rFonts w:ascii="Calibri" w:hAnsi="Calibri" w:cs="Calibri"/>
@@ -272,7 +272,7 @@
       <w:pPr>
         <w:numPr>
           <w:ilvl w:val="0"/>
-          <w:numId w:val="5"/>
+          <w:numId w:val="3"/>
         </w:numPr>
         <w:rPr>
           <w:rFonts w:ascii="Calibri" w:hAnsi="Calibri" w:cs="Calibri"/>
@@ -289,7 +289,7 @@
       <w:pPr>
         <w:numPr>
           <w:ilvl w:val="0"/>
-          <w:numId w:val="5"/>
+          <w:numId w:val="3"/>
         </w:numPr>
         <w:rPr>
           <w:rFonts w:ascii="Calibri" w:hAnsi="Calibri" w:cs="Calibri"/>
@@ -381,7 +381,7 @@
       <w:pPr>
         <w:numPr>
           <w:ilvl w:val="0"/>
-          <w:numId w:val="6"/>
+          <w:numId w:val="4"/>
         </w:numPr>
         <w:rPr>
           <w:rFonts w:ascii="Calibri" w:hAnsi="Calibri" w:cs="Calibri"/>
@@ -398,7 +398,7 @@
       <w:pPr>
         <w:numPr>
           <w:ilvl w:val="0"/>
-          <w:numId w:val="6"/>
+          <w:numId w:val="4"/>
         </w:numPr>
         <w:rPr>
           <w:rFonts w:ascii="Calibri" w:hAnsi="Calibri" w:cs="Calibri"/>
@@ -415,7 +415,7 @@
       <w:pPr>
         <w:numPr>
           <w:ilvl w:val="0"/>
-          <w:numId w:val="6"/>
+          <w:numId w:val="4"/>
         </w:numPr>
         <w:rPr>
           <w:rFonts w:ascii="Calibri" w:hAnsi="Calibri" w:cs="Calibri"/>
@@ -432,7 +432,7 @@
       <w:pPr>
         <w:numPr>
           <w:ilvl w:val="0"/>
-          <w:numId w:val="6"/>
+          <w:numId w:val="4"/>
         </w:numPr>
         <w:rPr>
           <w:rFonts w:ascii="Calibri" w:hAnsi="Calibri" w:cs="Calibri"/>
@@ -528,25 +528,13 @@
         </w:rPr>
       </w:pPr>
       <w:r>
-        <w:rPr>
-          <w:rFonts w:ascii="Calibri" w:hAnsi="Calibri" w:cs="Calibri"/>
-        </w:rPr>
         <w:lastRenderedPageBreak/>
-        <w:br/>
-      </w:r>
-      <w:proofErr w:type="gramStart"/>
-      <w:r>
-        <w:rPr>
-          <w:rFonts w:ascii="Calibri" w:hAnsi="Calibri" w:cs="Calibri"/>
-        </w:rPr>
-        <w:t>Text :</w:t>
-      </w:r>
-      <w:proofErr w:type="gramEnd"/>
-      <w:r>
-        <w:rPr>
-          <w:rFonts w:ascii="Calibri" w:hAnsi="Calibri" w:cs="Calibri"/>
-        </w:rPr>
-        <w:t>: Vaccine effectiveness measures the reduction in disease risk among vaccinated individuals compared to unvaccinated individuals in real-world conditions.</w:t>
+        <w:t>Vaccine effectiveness measures the reduction in disease risk among vaccinated individuals compared to unvaccinated individuals in real-world conditions.</w:t>
+      </w:r>
+    </w:p>
+    <w:p>
+      <w:r>
+        <w:t>END Callout</w:t>
       </w:r>
     </w:p>
     <w:p>
@@ -917,52 +905,61 @@
         </w:rPr>
       </w:pPr>
       <w:r>
-        <w:rPr>
-          <w:rFonts w:ascii="Calibri" w:hAnsi="Calibri" w:cs="Calibri"/>
-        </w:rPr>
         <w:t>Reveal</w:t>
       </w:r>
-      <w:r>
-        <w:rPr>
-          <w:rFonts w:ascii="Calibri" w:hAnsi="Calibri" w:cs="Calibri"/>
-        </w:rPr>
-        <w:br/>
-        <w:t xml:space="preserve">Step </w:t>
-      </w:r>
-      <w:proofErr w:type="gramStart"/>
-      <w:r>
-        <w:rPr>
-          <w:rFonts w:ascii="Calibri" w:hAnsi="Calibri" w:cs="Calibri"/>
-        </w:rPr>
-        <w:t>1 :</w:t>
-      </w:r>
-      <w:proofErr w:type="gramEnd"/>
-      <w:r>
-        <w:rPr>
-          <w:rFonts w:ascii="Calibri" w:hAnsi="Calibri" w:cs="Calibri"/>
-        </w:rPr>
-        <w:t>: Calculate risk in the vaccinated group: 5 / 500 = 0.01</w:t>
-      </w:r>
-      <w:r>
-        <w:rPr>
-          <w:rFonts w:ascii="Calibri" w:hAnsi="Calibri" w:cs="Calibri"/>
-        </w:rPr>
-        <w:br/>
-        <w:t>Step 2 :: Calculate risk in the unvaccinated group: 25 / 500 = 0.05</w:t>
-      </w:r>
-      <w:r>
-        <w:rPr>
-          <w:rFonts w:ascii="Calibri" w:hAnsi="Calibri" w:cs="Calibri"/>
-        </w:rPr>
-        <w:br/>
-        <w:t>Step 3 :: Relative Risk = 0.01 / 0.05 = 0.2</w:t>
-      </w:r>
-      <w:r>
-        <w:rPr>
-          <w:rFonts w:ascii="Calibri" w:hAnsi="Calibri" w:cs="Calibri"/>
-        </w:rPr>
-        <w:br/>
-        <w:t>Step 4 :: VE = (1 − 0.2) × 100 = 80%</w:t>
+    </w:p>
+    <w:p>
+      <w:r>
+        <w:t>Label :: Show calculation</w:t>
+      </w:r>
+    </w:p>
+    <w:p>
+      <w:pPr>
+        <w:numPr>
+          <w:ilvl w:val="0"/>
+          <w:numId w:val="1"/>
+        </w:numPr>
+      </w:pPr>
+      <w:r>
+        <w:t>Calculate risk in the vaccinated group: 5 / 500 = 0.01</w:t>
+      </w:r>
+    </w:p>
+    <w:p>
+      <w:pPr>
+        <w:numPr>
+          <w:ilvl w:val="0"/>
+          <w:numId w:val="1"/>
+        </w:numPr>
+      </w:pPr>
+      <w:r>
+        <w:t>Calculate risk in the unvaccinated group: 25 / 500 = 0.05</w:t>
+      </w:r>
+    </w:p>
+    <w:p>
+      <w:pPr>
+        <w:numPr>
+          <w:ilvl w:val="0"/>
+          <w:numId w:val="1"/>
+        </w:numPr>
+      </w:pPr>
+      <w:r>
+        <w:t>Relative Risk = 0.01 / 0.05 = 0.2</w:t>
+      </w:r>
+    </w:p>
+    <w:p>
+      <w:pPr>
+        <w:numPr>
+          <w:ilvl w:val="0"/>
+          <w:numId w:val="1"/>
+        </w:numPr>
+      </w:pPr>
+      <w:r>
+        <w:t>VE = (1 − 0.2) × 100 = 80%</w:t>
+      </w:r>
+    </w:p>
+    <w:p>
+      <w:r>
+        <w:t>END Reveal</w:t>
       </w:r>
     </w:p>
     <w:p>
@@ -999,49 +996,36 @@
           <w:rFonts w:ascii="Calibri" w:hAnsi="Calibri" w:cs="Calibri"/>
         </w:rPr>
       </w:pPr>
+      <w:r>
+        <w:t>SelfCheck</w:t>
+      </w:r>
+    </w:p>
+    <w:p>
+      <w:r>
+        <w:t>Question :: Why might vaccine effectiveness differ between populations?</w:t>
+      </w:r>
+    </w:p>
+    <w:p>
+      <w:r>
+        <w:t>Answer :: Differences in exposure, population structure, healthcare access, and underlying health conditions can influence estimates.</w:t>
+      </w:r>
+    </w:p>
+    <w:p>
+      <w:r>
+        <w:t xml:space="preserve">END </w:t>
+      </w:r>
       <w:proofErr w:type="spellStart"/>
       <w:r>
-        <w:rPr>
-          <w:rFonts w:ascii="Calibri" w:hAnsi="Calibri" w:cs="Calibri"/>
-        </w:rPr>
         <w:t>SelfCheck</w:t>
       </w:r>
       <w:proofErr w:type="spellEnd"/>
-      <w:r>
-        <w:rPr>
-          <w:rFonts w:ascii="Calibri" w:hAnsi="Calibri" w:cs="Calibri"/>
-        </w:rPr>
-        <w:br/>
-      </w:r>
-      <w:proofErr w:type="gramStart"/>
-      <w:r>
-        <w:rPr>
-          <w:rFonts w:ascii="Calibri" w:hAnsi="Calibri" w:cs="Calibri"/>
-        </w:rPr>
-        <w:t>Question :</w:t>
-      </w:r>
-      <w:proofErr w:type="gramEnd"/>
-      <w:r>
-        <w:rPr>
-          <w:rFonts w:ascii="Calibri" w:hAnsi="Calibri" w:cs="Calibri"/>
-        </w:rPr>
-        <w:t>: Why might vaccine effectiveness differ between populations?</w:t>
-      </w:r>
-      <w:r>
-        <w:rPr>
-          <w:rFonts w:ascii="Calibri" w:hAnsi="Calibri" w:cs="Calibri"/>
-        </w:rPr>
-        <w:br/>
-        <w:t>Answer :: Differences in exposure, population structure, healthcare access, and underlying health conditions can influence estimates.</w:t>
-      </w:r>
-    </w:p>
-    <w:p>
-      <w:pPr>
-        <w:rPr>
-          <w:rFonts w:ascii="Calibri" w:hAnsi="Calibri" w:cs="Calibri"/>
-        </w:rPr>
-      </w:pPr>
-    </w:p>
+    </w:p>
+    <w:p/>
+    <w:p/>
+    <w:p/>
+    <w:p/>
+    <w:p/>
+    <w:p/>
     <w:p>
       <w:pPr>
         <w:pStyle w:val="Heading2"/>
@@ -1049,6 +1033,89 @@
           <w:rFonts w:ascii="Calibri" w:hAnsi="Calibri" w:cs="Calibri"/>
         </w:rPr>
       </w:pPr>
+      <w:proofErr w:type="spellStart"/>
+      <w:r>
+        <w:rPr>
+          <w:rFonts w:ascii="Calibri" w:hAnsi="Calibri" w:cs="Calibri"/>
+        </w:rPr>
+        <w:lastRenderedPageBreak/>
+        <w:t>Plotly</w:t>
+      </w:r>
+      <w:proofErr w:type="spellEnd"/>
+      <w:r>
+        <w:rPr>
+          <w:rFonts w:ascii="Calibri" w:hAnsi="Calibri" w:cs="Calibri"/>
+        </w:rPr>
+        <w:t xml:space="preserve"> </w:t>
+      </w:r>
+      <w:r>
+        <w:rPr>
+          <w:rFonts w:ascii="Calibri" w:hAnsi="Calibri" w:cs="Calibri"/>
+        </w:rPr>
+        <w:t xml:space="preserve">Data </w:t>
+      </w:r>
+      <w:proofErr w:type="spellStart"/>
+      <w:r>
+        <w:rPr>
+          <w:rFonts w:ascii="Calibri" w:hAnsi="Calibri" w:cs="Calibri"/>
+        </w:rPr>
+        <w:t>visualistion</w:t>
+      </w:r>
+      <w:proofErr w:type="spellEnd"/>
+    </w:p>
+    <w:p/>
+    <w:p>
+      <w:r>
+        <w:t xml:space="preserve">HTML </w:t>
+      </w:r>
+      <w:proofErr w:type="gramStart"/>
+      <w:r>
+        <w:t>Embed :</w:t>
+      </w:r>
+      <w:proofErr w:type="gramEnd"/>
+      <w:r>
+        <w:t>: resources/html/steph1_plotly_distribution_demo_standalone.html</w:t>
+      </w:r>
+    </w:p>
+    <w:p>
+      <w:proofErr w:type="gramStart"/>
+      <w:r>
+        <w:t>Title :</w:t>
+      </w:r>
+      <w:proofErr w:type="gramEnd"/>
+      <w:r>
+        <w:t>: Distribution Explorer: Health-Related Measures</w:t>
+      </w:r>
+    </w:p>
+    <w:p>
+      <w:proofErr w:type="gramStart"/>
+      <w:r>
+        <w:t>Height :</w:t>
+      </w:r>
+      <w:proofErr w:type="gramEnd"/>
+      <w:r>
+        <w:t>: 750</w:t>
+      </w:r>
+    </w:p>
+    <w:p>
+      <w:r>
+        <w:t>END HTML Embed</w:t>
+      </w:r>
+    </w:p>
+    <w:p>
+      <w:pPr>
+        <w:rPr>
+          <w:rFonts w:ascii="Calibri" w:hAnsi="Calibri" w:cs="Calibri"/>
+        </w:rPr>
+      </w:pPr>
+    </w:p>
+    <w:p>
+      <w:pPr>
+        <w:pStyle w:val="Heading2"/>
+        <w:rPr>
+          <w:rFonts w:ascii="Calibri" w:hAnsi="Calibri" w:cs="Calibri"/>
+        </w:rPr>
+      </w:pPr>
       <w:r>
         <w:rPr>
           <w:rFonts w:ascii="Calibri" w:hAnsi="Calibri" w:cs="Calibri"/>
@@ -1117,7 +1184,6 @@
         <w:rPr>
           <w:rFonts w:ascii="Calibri" w:hAnsi="Calibri" w:cs="Calibri"/>
         </w:rPr>
-        <w:lastRenderedPageBreak/>
         <w:t>Panopto</w:t>
       </w:r>
     </w:p>
@@ -3169,50 +3235,57 @@
         </w:rPr>
       </w:pPr>
       <w:r>
-        <w:rPr>
-          <w:rFonts w:ascii="Calibri" w:hAnsi="Calibri" w:cs="Calibri"/>
-        </w:rPr>
         <w:t>Tabs</w:t>
       </w:r>
-      <w:r>
-        <w:rPr>
-          <w:rFonts w:ascii="Calibri" w:hAnsi="Calibri" w:cs="Calibri"/>
-        </w:rPr>
-        <w:br/>
-      </w:r>
-      <w:proofErr w:type="gramStart"/>
-      <w:r>
-        <w:rPr>
-          <w:rFonts w:ascii="Calibri" w:hAnsi="Calibri" w:cs="Calibri"/>
-        </w:rPr>
-        <w:t>Interpretation :</w:t>
-      </w:r>
-      <w:proofErr w:type="gramEnd"/>
-      <w:r>
-        <w:rPr>
-          <w:rFonts w:ascii="Calibri" w:hAnsi="Calibri" w:cs="Calibri"/>
-        </w:rPr>
-        <w:t>: An 80% vaccine effectiveness means vaccinated individuals have substantially lower risk compared to unvaccinated individuals.</w:t>
-      </w:r>
-      <w:r>
-        <w:rPr>
-          <w:rFonts w:ascii="Calibri" w:hAnsi="Calibri" w:cs="Calibri"/>
-        </w:rPr>
-        <w:br/>
-        <w:t>Assumptions :: The calculation assumes both groups are comparable and equally exposed.</w:t>
-      </w:r>
-      <w:r>
-        <w:rPr>
-          <w:rFonts w:ascii="Calibri" w:hAnsi="Calibri" w:cs="Calibri"/>
-        </w:rPr>
-        <w:br/>
-      </w:r>
-      <w:r>
-        <w:rPr>
-          <w:rFonts w:ascii="Calibri" w:hAnsi="Calibri" w:cs="Calibri"/>
-        </w:rPr>
-        <w:lastRenderedPageBreak/>
-        <w:t>Limitations :: Confounding factors such as age, immunity, or healthcare access may influence results.</w:t>
+    </w:p>
+    <w:p>
+      <w:r>
+        <w:t>Tab :: Interpretation</w:t>
+      </w:r>
+    </w:p>
+    <w:p>
+      <w:r>
+        <w:t>An 80% vaccine effectiveness means vaccinated individuals have substantially lower risk compared to unvaccinated individuals.</w:t>
+      </w:r>
+    </w:p>
+    <w:p>
+      <w:r>
+        <w:t>END Tab</w:t>
+      </w:r>
+    </w:p>
+    <w:p>
+      <w:r>
+        <w:t>Tab :: Assumptions</w:t>
+      </w:r>
+    </w:p>
+    <w:p>
+      <w:r>
+        <w:t>The calculation assumes both groups are comparable and equally exposed.</w:t>
+      </w:r>
+    </w:p>
+    <w:p>
+      <w:r>
+        <w:t>END Tab</w:t>
+      </w:r>
+    </w:p>
+    <w:p>
+      <w:r>
+        <w:t>Tab :: Limitations</w:t>
+      </w:r>
+    </w:p>
+    <w:p>
+      <w:r>
+        <w:t>Confounding factors such as age, immunity, or healthcare access may influence results.</w:t>
+      </w:r>
+    </w:p>
+    <w:p>
+      <w:r>
+        <w:t>END Tab</w:t>
+      </w:r>
+    </w:p>
+    <w:p>
+      <w:r>
+        <w:t>END Tabs</w:t>
       </w:r>
     </w:p>
     <w:p>
@@ -3249,40 +3322,28 @@
           <w:rFonts w:ascii="Calibri" w:hAnsi="Calibri" w:cs="Calibri"/>
         </w:rPr>
       </w:pPr>
-      <w:proofErr w:type="gramStart"/>
-      <w:r>
-        <w:rPr>
-          <w:rFonts w:ascii="Calibri" w:hAnsi="Calibri" w:cs="Calibri"/>
-        </w:rPr>
-        <w:t>Image :</w:t>
-      </w:r>
-      <w:proofErr w:type="gramEnd"/>
-      <w:r>
-        <w:rPr>
-          <w:rFonts w:ascii="Calibri" w:hAnsi="Calibri" w:cs="Calibri"/>
-        </w:rPr>
-        <w:t>: resources/images/epidemic-curve.png</w:t>
-      </w:r>
-      <w:r>
-        <w:rPr>
-          <w:rFonts w:ascii="Calibri" w:hAnsi="Calibri" w:cs="Calibri"/>
-        </w:rPr>
-        <w:br/>
+      <w:r>
+        <w:t>Image :: resources/images/epidemic-curve.png</w:t>
+      </w:r>
+    </w:p>
+    <w:p>
+      <w:r>
         <w:t>Alt :: Epidemic curve showing number of measles cases over time by vaccination status</w:t>
       </w:r>
-      <w:r>
-        <w:rPr>
-          <w:rFonts w:ascii="Calibri" w:hAnsi="Calibri" w:cs="Calibri"/>
-        </w:rPr>
-        <w:br/>
+    </w:p>
+    <w:p>
+      <w:r>
         <w:t>Caption :: Epidemic curve comparing vaccinated and unvaccinated groups.</w:t>
       </w:r>
-      <w:r>
-        <w:rPr>
-          <w:rFonts w:ascii="Calibri" w:hAnsi="Calibri" w:cs="Calibri"/>
-        </w:rPr>
-        <w:br/>
+    </w:p>
+    <w:p>
+      <w:r>
         <w:t>Width :: 70%</w:t>
+      </w:r>
+    </w:p>
+    <w:p>
+      <w:r>
+        <w:t>END Image</w:t>
       </w:r>
     </w:p>
     <w:p>
@@ -3330,33 +3391,1161 @@
           <w:rFonts w:ascii="Calibri" w:hAnsi="Calibri" w:cs="Calibri"/>
         </w:rPr>
       </w:pPr>
-      <w:proofErr w:type="gramStart"/>
-      <w:r>
-        <w:rPr>
-          <w:rFonts w:ascii="Calibri" w:hAnsi="Calibri" w:cs="Calibri"/>
-        </w:rPr>
-        <w:t>File :</w:t>
-      </w:r>
-      <w:proofErr w:type="gramEnd"/>
-      <w:r>
-        <w:rPr>
-          <w:rFonts w:ascii="Calibri" w:hAnsi="Calibri" w:cs="Calibri"/>
-        </w:rPr>
-        <w:t>: resources/pdf/outbreak-report.pdf</w:t>
-      </w:r>
+      <w:r>
+        <w:t>File :: resources/pdf/outbreak-report.pdf</w:t>
+      </w:r>
+    </w:p>
+    <w:p>
+      <w:r>
+        <w:t>Display :: embed</w:t>
+      </w:r>
+    </w:p>
+    <w:p>
+      <w:r>
+        <w:t>Label :: View full outbreak investigation report</w:t>
+      </w:r>
+    </w:p>
+    <w:p>
+      <w:r>
+        <w:t>END File</w:t>
+      </w:r>
+    </w:p>
+    <w:p>
+      <w:pPr>
+        <w:rPr>
+          <w:rFonts w:ascii="Calibri" w:hAnsi="Calibri" w:cs="Calibri"/>
+        </w:rPr>
+      </w:pPr>
+    </w:p>
+    <w:p>
+      <w:pPr>
+        <w:pStyle w:val="Heading2"/>
+        <w:rPr>
+          <w:rFonts w:ascii="Calibri" w:hAnsi="Calibri" w:cs="Calibri"/>
+        </w:rPr>
+      </w:pPr>
+      <w:r>
+        <w:rPr>
+          <w:rFonts w:ascii="Calibri" w:hAnsi="Calibri" w:cs="Calibri"/>
+        </w:rPr>
+        <w:t>Download Dataset</w:t>
+      </w:r>
+    </w:p>
+    <w:p>
+      <w:pPr>
+        <w:rPr>
+          <w:rFonts w:ascii="Calibri" w:hAnsi="Calibri" w:cs="Calibri"/>
+        </w:rPr>
+      </w:pPr>
+    </w:p>
+    <w:p>
+      <w:pPr>
+        <w:rPr>
+          <w:rFonts w:ascii="Calibri" w:hAnsi="Calibri" w:cs="Calibri"/>
+        </w:rPr>
+      </w:pPr>
+      <w:r>
+        <w:t>File :: resources/data/outbreak-dataset.zip</w:t>
+      </w:r>
+    </w:p>
+    <w:p>
+      <w:r>
+        <w:t>Label :: Download full dataset</w:t>
+      </w:r>
+    </w:p>
+    <w:p>
+      <w:r>
+        <w:t>END File</w:t>
+      </w:r>
+    </w:p>
+    <w:p>
+      <w:pPr>
+        <w:rPr>
+          <w:rFonts w:ascii="Calibri" w:hAnsi="Calibri" w:cs="Calibri"/>
+        </w:rPr>
+      </w:pPr>
+    </w:p>
+    <w:p>
+      <w:pPr>
+        <w:rPr>
+          <w:rFonts w:ascii="Calibri" w:hAnsi="Calibri" w:cs="Calibri"/>
+        </w:rPr>
+      </w:pPr>
+    </w:p>
+    <w:p>
+      <w:pPr>
+        <w:pStyle w:val="Heading2"/>
+        <w:rPr>
+          <w:rFonts w:ascii="Calibri" w:hAnsi="Calibri" w:cs="Calibri"/>
+        </w:rPr>
+      </w:pPr>
+      <w:r>
+        <w:rPr>
+          <w:rFonts w:ascii="Calibri" w:hAnsi="Calibri" w:cs="Calibri"/>
+        </w:rPr>
+        <w:lastRenderedPageBreak/>
+        <w:t xml:space="preserve">Single </w:t>
+      </w:r>
+      <w:r>
+        <w:rPr>
+          <w:rFonts w:ascii="Calibri" w:hAnsi="Calibri" w:cs="Calibri"/>
+        </w:rPr>
+        <w:t>Quiz</w:t>
+      </w:r>
+    </w:p>
+    <w:p>
+      <w:pPr>
+        <w:rPr>
+          <w:rFonts w:ascii="Calibri" w:hAnsi="Calibri" w:cs="Calibri"/>
+        </w:rPr>
+      </w:pPr>
       <w:r>
         <w:rPr>
           <w:rFonts w:ascii="Calibri" w:hAnsi="Calibri" w:cs="Calibri"/>
         </w:rPr>
         <w:br/>
-        <w:t>Display :: embed</w:t>
+      </w:r>
+      <w:r>
+        <w:rPr>
+          <w:rFonts w:ascii="Calibri" w:hAnsi="Calibri" w:cs="Calibri"/>
+        </w:rPr>
+        <w:t>Quiz</w:t>
+      </w:r>
+    </w:p>
+    <w:p>
+      <w:pPr>
+        <w:rPr>
+          <w:rFonts w:ascii="Calibri" w:hAnsi="Calibri" w:cs="Calibri"/>
+        </w:rPr>
+      </w:pPr>
+      <w:proofErr w:type="gramStart"/>
+      <w:r>
+        <w:rPr>
+          <w:rFonts w:ascii="Calibri" w:hAnsi="Calibri" w:cs="Calibri"/>
+        </w:rPr>
+        <w:t>Type :</w:t>
+      </w:r>
+      <w:proofErr w:type="gramEnd"/>
+      <w:r>
+        <w:rPr>
+          <w:rFonts w:ascii="Calibri" w:hAnsi="Calibri" w:cs="Calibri"/>
+        </w:rPr>
+        <w:t>: single</w:t>
+      </w:r>
+    </w:p>
+    <w:p>
+      <w:pPr>
+        <w:rPr>
+          <w:rFonts w:ascii="Calibri" w:hAnsi="Calibri" w:cs="Calibri"/>
+        </w:rPr>
+      </w:pPr>
+      <w:proofErr w:type="gramStart"/>
+      <w:r>
+        <w:rPr>
+          <w:rFonts w:ascii="Calibri" w:hAnsi="Calibri" w:cs="Calibri"/>
+        </w:rPr>
+        <w:t>Question :</w:t>
+      </w:r>
+      <w:proofErr w:type="gramEnd"/>
+      <w:r>
+        <w:rPr>
+          <w:rFonts w:ascii="Calibri" w:hAnsi="Calibri" w:cs="Calibri"/>
+        </w:rPr>
+        <w:t>: Which R code correctly identifies patients with systolic blood pressure greater than or equal to 140 mmHg?</w:t>
+      </w:r>
+    </w:p>
+    <w:p>
+      <w:pPr>
+        <w:rPr>
+          <w:rFonts w:ascii="Calibri" w:hAnsi="Calibri" w:cs="Calibri"/>
+        </w:rPr>
+      </w:pPr>
+    </w:p>
+    <w:p>
+      <w:pPr>
+        <w:rPr>
+          <w:rFonts w:ascii="Calibri" w:hAnsi="Calibri" w:cs="Calibri"/>
+        </w:rPr>
+      </w:pPr>
+      <w:r>
+        <w:rPr>
+          <w:rFonts w:ascii="Calibri" w:hAnsi="Calibri" w:cs="Calibri"/>
+        </w:rPr>
+        <w:t>Option</w:t>
+      </w:r>
+    </w:p>
+    <w:p>
+      <w:pPr>
+        <w:rPr>
+          <w:rFonts w:ascii="Calibri" w:hAnsi="Calibri" w:cs="Calibri"/>
+        </w:rPr>
+      </w:pPr>
+      <w:proofErr w:type="gramStart"/>
+      <w:r>
+        <w:rPr>
+          <w:rFonts w:ascii="Calibri" w:hAnsi="Calibri" w:cs="Calibri"/>
+        </w:rPr>
+        <w:t>Correct :</w:t>
+      </w:r>
+      <w:proofErr w:type="gramEnd"/>
+      <w:r>
+        <w:rPr>
+          <w:rFonts w:ascii="Calibri" w:hAnsi="Calibri" w:cs="Calibri"/>
+        </w:rPr>
+        <w:t>: yes</w:t>
+      </w:r>
+    </w:p>
+    <w:p>
+      <w:pPr>
+        <w:rPr>
+          <w:rFonts w:ascii="Calibri" w:hAnsi="Calibri" w:cs="Calibri"/>
+        </w:rPr>
+      </w:pPr>
+    </w:p>
+    <w:p>
+      <w:pPr>
+        <w:rPr>
+          <w:rFonts w:ascii="Calibri" w:hAnsi="Calibri" w:cs="Calibri"/>
+        </w:rPr>
+      </w:pPr>
+      <w:r>
+        <w:rPr>
+          <w:rFonts w:ascii="Calibri" w:hAnsi="Calibri" w:cs="Calibri"/>
+        </w:rPr>
+        <w:t xml:space="preserve">The following code uses </w:t>
+      </w:r>
+      <w:proofErr w:type="spellStart"/>
+      <w:r>
+        <w:rPr>
+          <w:rFonts w:ascii="Calibri" w:hAnsi="Calibri" w:cs="Calibri"/>
+        </w:rPr>
+        <w:t>dplyr</w:t>
+      </w:r>
+      <w:proofErr w:type="spellEnd"/>
+      <w:r>
+        <w:rPr>
+          <w:rFonts w:ascii="Calibri" w:hAnsi="Calibri" w:cs="Calibri"/>
+        </w:rPr>
+        <w:t xml:space="preserve"> and the correct comparison operator:</w:t>
+      </w:r>
+    </w:p>
+    <w:p>
+      <w:pPr>
+        <w:rPr>
+          <w:rFonts w:ascii="Calibri" w:hAnsi="Calibri" w:cs="Calibri"/>
+        </w:rPr>
+      </w:pPr>
+    </w:p>
+    <w:p>
+      <w:pPr>
+        <w:rPr>
+          <w:rFonts w:ascii="Calibri" w:hAnsi="Calibri" w:cs="Calibri"/>
+        </w:rPr>
+      </w:pPr>
+      <w:r>
+        <w:rPr>
+          <w:rFonts w:ascii="Calibri" w:hAnsi="Calibri" w:cs="Calibri"/>
+        </w:rPr>
+        <w:t>R Example</w:t>
+      </w:r>
+    </w:p>
+    <w:p>
+      <w:pPr>
+        <w:rPr>
+          <w:rFonts w:ascii="Calibri" w:hAnsi="Calibri" w:cs="Calibri"/>
+        </w:rPr>
+      </w:pPr>
+      <w:r>
+        <w:rPr>
+          <w:rFonts w:ascii="Calibri" w:hAnsi="Calibri" w:cs="Calibri"/>
+        </w:rPr>
+        <w:t xml:space="preserve">R </w:t>
+      </w:r>
+      <w:proofErr w:type="gramStart"/>
+      <w:r>
+        <w:rPr>
+          <w:rFonts w:ascii="Calibri" w:hAnsi="Calibri" w:cs="Calibri"/>
+        </w:rPr>
+        <w:t>Mode :</w:t>
+      </w:r>
+      <w:proofErr w:type="gramEnd"/>
+      <w:r>
+        <w:rPr>
+          <w:rFonts w:ascii="Calibri" w:hAnsi="Calibri" w:cs="Calibri"/>
+        </w:rPr>
+        <w:t>: static</w:t>
+      </w:r>
+    </w:p>
+    <w:p>
+      <w:pPr>
+        <w:rPr>
+          <w:rFonts w:ascii="Calibri" w:hAnsi="Calibri" w:cs="Calibri"/>
+        </w:rPr>
+      </w:pPr>
+      <w:proofErr w:type="gramStart"/>
+      <w:r>
+        <w:rPr>
+          <w:rFonts w:ascii="Calibri" w:hAnsi="Calibri" w:cs="Calibri"/>
+        </w:rPr>
+        <w:t>Echo :</w:t>
+      </w:r>
+      <w:proofErr w:type="gramEnd"/>
+      <w:r>
+        <w:rPr>
+          <w:rFonts w:ascii="Calibri" w:hAnsi="Calibri" w:cs="Calibri"/>
+        </w:rPr>
+        <w:t>: true</w:t>
+      </w:r>
+    </w:p>
+    <w:p>
+      <w:pPr>
+        <w:rPr>
+          <w:rFonts w:ascii="Calibri" w:hAnsi="Calibri" w:cs="Calibri"/>
+        </w:rPr>
+      </w:pPr>
+      <w:proofErr w:type="gramStart"/>
+      <w:r>
+        <w:rPr>
+          <w:rFonts w:ascii="Calibri" w:hAnsi="Calibri" w:cs="Calibri"/>
+        </w:rPr>
+        <w:t>Output :</w:t>
+      </w:r>
+      <w:proofErr w:type="gramEnd"/>
+      <w:r>
+        <w:rPr>
+          <w:rFonts w:ascii="Calibri" w:hAnsi="Calibri" w:cs="Calibri"/>
+        </w:rPr>
+        <w:t>: false</w:t>
+      </w:r>
+    </w:p>
+    <w:p>
+      <w:pPr>
+        <w:rPr>
+          <w:rFonts w:ascii="Calibri" w:hAnsi="Calibri" w:cs="Calibri"/>
+        </w:rPr>
+      </w:pPr>
+    </w:p>
+    <w:p>
+      <w:pPr>
+        <w:rPr>
+          <w:rFonts w:ascii="Calibri" w:hAnsi="Calibri" w:cs="Calibri"/>
+        </w:rPr>
+      </w:pPr>
+      <w:r>
+        <w:rPr>
+          <w:rFonts w:ascii="Calibri" w:hAnsi="Calibri" w:cs="Calibri"/>
+        </w:rPr>
+        <w:t>patients |&gt;</w:t>
+      </w:r>
+    </w:p>
+    <w:p>
+      <w:pPr>
+        <w:rPr>
+          <w:rFonts w:ascii="Calibri" w:hAnsi="Calibri" w:cs="Calibri"/>
+        </w:rPr>
+      </w:pPr>
+      <w:r>
+        <w:rPr>
+          <w:rFonts w:ascii="Calibri" w:hAnsi="Calibri" w:cs="Calibri"/>
+        </w:rPr>
+        <w:t xml:space="preserve">  </w:t>
+      </w:r>
+      <w:proofErr w:type="spellStart"/>
+      <w:proofErr w:type="gramStart"/>
+      <w:r>
+        <w:rPr>
+          <w:rFonts w:ascii="Calibri" w:hAnsi="Calibri" w:cs="Calibri"/>
+        </w:rPr>
+        <w:t>dplyr</w:t>
+      </w:r>
+      <w:proofErr w:type="spellEnd"/>
+      <w:r>
+        <w:rPr>
+          <w:rFonts w:ascii="Calibri" w:hAnsi="Calibri" w:cs="Calibri"/>
+        </w:rPr>
+        <w:t>::filter(</w:t>
+      </w:r>
+      <w:proofErr w:type="spellStart"/>
+      <w:proofErr w:type="gramEnd"/>
+      <w:r>
+        <w:rPr>
+          <w:rFonts w:ascii="Calibri" w:hAnsi="Calibri" w:cs="Calibri"/>
+        </w:rPr>
+        <w:t>systolic_bp</w:t>
+      </w:r>
+      <w:proofErr w:type="spellEnd"/>
+      <w:r>
+        <w:rPr>
+          <w:rFonts w:ascii="Calibri" w:hAnsi="Calibri" w:cs="Calibri"/>
+        </w:rPr>
+        <w:t xml:space="preserve"> &gt;= 140)</w:t>
+      </w:r>
+    </w:p>
+    <w:p>
+      <w:pPr>
+        <w:rPr>
+          <w:rFonts w:ascii="Calibri" w:hAnsi="Calibri" w:cs="Calibri"/>
+        </w:rPr>
+      </w:pPr>
+    </w:p>
+    <w:p>
+      <w:pPr>
+        <w:rPr>
+          <w:rFonts w:ascii="Calibri" w:hAnsi="Calibri" w:cs="Calibri"/>
+        </w:rPr>
+      </w:pPr>
+      <w:r>
+        <w:rPr>
+          <w:rFonts w:ascii="Calibri" w:hAnsi="Calibri" w:cs="Calibri"/>
+        </w:rPr>
+        <w:t>END R Example</w:t>
+      </w:r>
+    </w:p>
+    <w:p>
+      <w:pPr>
+        <w:rPr>
+          <w:rFonts w:ascii="Calibri" w:hAnsi="Calibri" w:cs="Calibri"/>
+        </w:rPr>
+      </w:pPr>
+    </w:p>
+    <w:p>
+      <w:pPr>
+        <w:rPr>
+          <w:rFonts w:ascii="Calibri" w:hAnsi="Calibri" w:cs="Calibri"/>
+        </w:rPr>
+      </w:pPr>
+      <w:proofErr w:type="gramStart"/>
+      <w:r>
+        <w:rPr>
+          <w:rFonts w:ascii="Calibri" w:hAnsi="Calibri" w:cs="Calibri"/>
+        </w:rPr>
+        <w:t>Feedback :</w:t>
+      </w:r>
+      <w:proofErr w:type="gramEnd"/>
+      <w:r>
+        <w:rPr>
+          <w:rFonts w:ascii="Calibri" w:hAnsi="Calibri" w:cs="Calibri"/>
+        </w:rPr>
+        <w:t>: Correct. The &gt;= operator retains patients with systolic blood pressure equal to or above 140 mmHg.</w:t>
+      </w:r>
+    </w:p>
+    <w:p>
+      <w:pPr>
+        <w:rPr>
+          <w:rFonts w:ascii="Calibri" w:hAnsi="Calibri" w:cs="Calibri"/>
+        </w:rPr>
+      </w:pPr>
+    </w:p>
+    <w:p>
+      <w:pPr>
+        <w:rPr>
+          <w:rFonts w:ascii="Calibri" w:hAnsi="Calibri" w:cs="Calibri"/>
+        </w:rPr>
+      </w:pPr>
+      <w:r>
+        <w:rPr>
+          <w:rFonts w:ascii="Calibri" w:hAnsi="Calibri" w:cs="Calibri"/>
+        </w:rPr>
+        <w:t>This includes a reading of exactly 140.</w:t>
+      </w:r>
+    </w:p>
+    <w:p>
+      <w:pPr>
+        <w:rPr>
+          <w:rFonts w:ascii="Calibri" w:hAnsi="Calibri" w:cs="Calibri"/>
+        </w:rPr>
+      </w:pPr>
+    </w:p>
+    <w:p>
+      <w:pPr>
+        <w:rPr>
+          <w:rFonts w:ascii="Calibri" w:hAnsi="Calibri" w:cs="Calibri"/>
+        </w:rPr>
+      </w:pPr>
+      <w:r>
+        <w:rPr>
+          <w:rFonts w:ascii="Calibri" w:hAnsi="Calibri" w:cs="Calibri"/>
+        </w:rPr>
+        <w:t>END Option</w:t>
+      </w:r>
+    </w:p>
+    <w:p>
+      <w:pPr>
+        <w:rPr>
+          <w:rFonts w:ascii="Calibri" w:hAnsi="Calibri" w:cs="Calibri"/>
+        </w:rPr>
+      </w:pPr>
+    </w:p>
+    <w:p>
+      <w:pPr>
+        <w:rPr>
+          <w:rFonts w:ascii="Calibri" w:hAnsi="Calibri" w:cs="Calibri"/>
+        </w:rPr>
+      </w:pPr>
+      <w:r>
+        <w:rPr>
+          <w:rFonts w:ascii="Calibri" w:hAnsi="Calibri" w:cs="Calibri"/>
+        </w:rPr>
+        <w:t>Option</w:t>
+      </w:r>
+    </w:p>
+    <w:p>
+      <w:pPr>
+        <w:rPr>
+          <w:rFonts w:ascii="Calibri" w:hAnsi="Calibri" w:cs="Calibri"/>
+        </w:rPr>
+      </w:pPr>
+      <w:proofErr w:type="gramStart"/>
+      <w:r>
+        <w:rPr>
+          <w:rFonts w:ascii="Calibri" w:hAnsi="Calibri" w:cs="Calibri"/>
+        </w:rPr>
+        <w:t>Correct :</w:t>
+      </w:r>
+      <w:proofErr w:type="gramEnd"/>
+      <w:r>
+        <w:rPr>
+          <w:rFonts w:ascii="Calibri" w:hAnsi="Calibri" w:cs="Calibri"/>
+        </w:rPr>
+        <w:t>: no</w:t>
+      </w:r>
+    </w:p>
+    <w:p>
+      <w:pPr>
+        <w:rPr>
+          <w:rFonts w:ascii="Calibri" w:hAnsi="Calibri" w:cs="Calibri"/>
+        </w:rPr>
+      </w:pPr>
+    </w:p>
+    <w:p>
+      <w:pPr>
+        <w:rPr>
+          <w:rFonts w:ascii="Calibri" w:hAnsi="Calibri" w:cs="Calibri"/>
+        </w:rPr>
+      </w:pPr>
+      <w:r>
+        <w:rPr>
+          <w:rFonts w:ascii="Calibri" w:hAnsi="Calibri" w:cs="Calibri"/>
+        </w:rPr>
+        <w:t>The following code selects values below 140:</w:t>
+      </w:r>
+    </w:p>
+    <w:p>
+      <w:pPr>
+        <w:rPr>
+          <w:rFonts w:ascii="Calibri" w:hAnsi="Calibri" w:cs="Calibri"/>
+        </w:rPr>
+      </w:pPr>
+    </w:p>
+    <w:p>
+      <w:pPr>
+        <w:rPr>
+          <w:rFonts w:ascii="Calibri" w:hAnsi="Calibri" w:cs="Calibri"/>
+        </w:rPr>
+      </w:pPr>
+      <w:r>
+        <w:rPr>
+          <w:rFonts w:ascii="Calibri" w:hAnsi="Calibri" w:cs="Calibri"/>
+        </w:rPr>
+        <w:t>R Example</w:t>
+      </w:r>
+    </w:p>
+    <w:p>
+      <w:pPr>
+        <w:rPr>
+          <w:rFonts w:ascii="Calibri" w:hAnsi="Calibri" w:cs="Calibri"/>
+        </w:rPr>
+      </w:pPr>
+      <w:r>
+        <w:rPr>
+          <w:rFonts w:ascii="Calibri" w:hAnsi="Calibri" w:cs="Calibri"/>
+        </w:rPr>
+        <w:t xml:space="preserve">R </w:t>
+      </w:r>
+      <w:proofErr w:type="gramStart"/>
+      <w:r>
+        <w:rPr>
+          <w:rFonts w:ascii="Calibri" w:hAnsi="Calibri" w:cs="Calibri"/>
+        </w:rPr>
+        <w:t>Mode :</w:t>
+      </w:r>
+      <w:proofErr w:type="gramEnd"/>
+      <w:r>
+        <w:rPr>
+          <w:rFonts w:ascii="Calibri" w:hAnsi="Calibri" w:cs="Calibri"/>
+        </w:rPr>
+        <w:t>: static</w:t>
+      </w:r>
+    </w:p>
+    <w:p>
+      <w:pPr>
+        <w:rPr>
+          <w:rFonts w:ascii="Calibri" w:hAnsi="Calibri" w:cs="Calibri"/>
+        </w:rPr>
+      </w:pPr>
+      <w:proofErr w:type="gramStart"/>
+      <w:r>
+        <w:rPr>
+          <w:rFonts w:ascii="Calibri" w:hAnsi="Calibri" w:cs="Calibri"/>
+        </w:rPr>
+        <w:t>Echo :</w:t>
+      </w:r>
+      <w:proofErr w:type="gramEnd"/>
+      <w:r>
+        <w:rPr>
+          <w:rFonts w:ascii="Calibri" w:hAnsi="Calibri" w:cs="Calibri"/>
+        </w:rPr>
+        <w:t>: true</w:t>
+      </w:r>
+    </w:p>
+    <w:p>
+      <w:pPr>
+        <w:rPr>
+          <w:rFonts w:ascii="Calibri" w:hAnsi="Calibri" w:cs="Calibri"/>
+        </w:rPr>
+      </w:pPr>
+      <w:proofErr w:type="gramStart"/>
+      <w:r>
+        <w:rPr>
+          <w:rFonts w:ascii="Calibri" w:hAnsi="Calibri" w:cs="Calibri"/>
+        </w:rPr>
+        <w:t>Output :</w:t>
+      </w:r>
+      <w:proofErr w:type="gramEnd"/>
+      <w:r>
+        <w:rPr>
+          <w:rFonts w:ascii="Calibri" w:hAnsi="Calibri" w:cs="Calibri"/>
+        </w:rPr>
+        <w:t>: false</w:t>
+      </w:r>
+    </w:p>
+    <w:p>
+      <w:pPr>
+        <w:rPr>
+          <w:rFonts w:ascii="Calibri" w:hAnsi="Calibri" w:cs="Calibri"/>
+        </w:rPr>
+      </w:pPr>
+    </w:p>
+    <w:p>
+      <w:pPr>
+        <w:rPr>
+          <w:rFonts w:ascii="Calibri" w:hAnsi="Calibri" w:cs="Calibri"/>
+        </w:rPr>
+      </w:pPr>
+      <w:r>
+        <w:rPr>
+          <w:rFonts w:ascii="Calibri" w:hAnsi="Calibri" w:cs="Calibri"/>
+        </w:rPr>
+        <w:t>patients |&gt;</w:t>
+      </w:r>
+    </w:p>
+    <w:p>
+      <w:pPr>
+        <w:rPr>
+          <w:rFonts w:ascii="Calibri" w:hAnsi="Calibri" w:cs="Calibri"/>
+        </w:rPr>
+      </w:pPr>
+      <w:r>
+        <w:rPr>
+          <w:rFonts w:ascii="Calibri" w:hAnsi="Calibri" w:cs="Calibri"/>
+        </w:rPr>
+        <w:t xml:space="preserve">  </w:t>
+      </w:r>
+      <w:proofErr w:type="spellStart"/>
+      <w:proofErr w:type="gramStart"/>
+      <w:r>
+        <w:rPr>
+          <w:rFonts w:ascii="Calibri" w:hAnsi="Calibri" w:cs="Calibri"/>
+        </w:rPr>
+        <w:t>dplyr</w:t>
+      </w:r>
+      <w:proofErr w:type="spellEnd"/>
+      <w:r>
+        <w:rPr>
+          <w:rFonts w:ascii="Calibri" w:hAnsi="Calibri" w:cs="Calibri"/>
+        </w:rPr>
+        <w:t>::filter(</w:t>
+      </w:r>
+      <w:proofErr w:type="spellStart"/>
+      <w:proofErr w:type="gramEnd"/>
+      <w:r>
+        <w:rPr>
+          <w:rFonts w:ascii="Calibri" w:hAnsi="Calibri" w:cs="Calibri"/>
+        </w:rPr>
+        <w:t>systolic_bp</w:t>
+      </w:r>
+      <w:proofErr w:type="spellEnd"/>
+      <w:r>
+        <w:rPr>
+          <w:rFonts w:ascii="Calibri" w:hAnsi="Calibri" w:cs="Calibri"/>
+        </w:rPr>
+        <w:t xml:space="preserve"> &lt; 140)</w:t>
+      </w:r>
+    </w:p>
+    <w:p>
+      <w:pPr>
+        <w:rPr>
+          <w:rFonts w:ascii="Calibri" w:hAnsi="Calibri" w:cs="Calibri"/>
+        </w:rPr>
+      </w:pPr>
+    </w:p>
+    <w:p>
+      <w:pPr>
+        <w:rPr>
+          <w:rFonts w:ascii="Calibri" w:hAnsi="Calibri" w:cs="Calibri"/>
+        </w:rPr>
+      </w:pPr>
+      <w:r>
+        <w:rPr>
+          <w:rFonts w:ascii="Calibri" w:hAnsi="Calibri" w:cs="Calibri"/>
+        </w:rPr>
+        <w:t>END R Example</w:t>
+      </w:r>
+    </w:p>
+    <w:p>
+      <w:pPr>
+        <w:rPr>
+          <w:rFonts w:ascii="Calibri" w:hAnsi="Calibri" w:cs="Calibri"/>
+        </w:rPr>
+      </w:pPr>
+    </w:p>
+    <w:p>
+      <w:pPr>
+        <w:rPr>
+          <w:rFonts w:ascii="Calibri" w:hAnsi="Calibri" w:cs="Calibri"/>
+        </w:rPr>
+      </w:pPr>
+      <w:proofErr w:type="gramStart"/>
+      <w:r>
+        <w:rPr>
+          <w:rFonts w:ascii="Calibri" w:hAnsi="Calibri" w:cs="Calibri"/>
+        </w:rPr>
+        <w:t>Feedback :</w:t>
+      </w:r>
+      <w:proofErr w:type="gramEnd"/>
+      <w:r>
+        <w:rPr>
+          <w:rFonts w:ascii="Calibri" w:hAnsi="Calibri" w:cs="Calibri"/>
+        </w:rPr>
+        <w:t>: Not quite. The &lt; operator selects patients below the threshold rather than those at or above it.</w:t>
+      </w:r>
+    </w:p>
+    <w:p>
+      <w:pPr>
+        <w:rPr>
+          <w:rFonts w:ascii="Calibri" w:hAnsi="Calibri" w:cs="Calibri"/>
+        </w:rPr>
+      </w:pPr>
+    </w:p>
+    <w:p>
+      <w:pPr>
+        <w:rPr>
+          <w:rFonts w:ascii="Calibri" w:hAnsi="Calibri" w:cs="Calibri"/>
+        </w:rPr>
+      </w:pPr>
+      <w:r>
+        <w:rPr>
+          <w:rFonts w:ascii="Calibri" w:hAnsi="Calibri" w:cs="Calibri"/>
+        </w:rPr>
+        <w:lastRenderedPageBreak/>
+        <w:t>END Option</w:t>
+      </w:r>
+    </w:p>
+    <w:p>
+      <w:pPr>
+        <w:rPr>
+          <w:rFonts w:ascii="Calibri" w:hAnsi="Calibri" w:cs="Calibri"/>
+        </w:rPr>
+      </w:pPr>
+    </w:p>
+    <w:p>
+      <w:pPr>
+        <w:rPr>
+          <w:rFonts w:ascii="Calibri" w:hAnsi="Calibri" w:cs="Calibri"/>
+        </w:rPr>
+      </w:pPr>
+      <w:r>
+        <w:rPr>
+          <w:rFonts w:ascii="Calibri" w:hAnsi="Calibri" w:cs="Calibri"/>
+        </w:rPr>
+        <w:t>Option</w:t>
+      </w:r>
+    </w:p>
+    <w:p>
+      <w:pPr>
+        <w:rPr>
+          <w:rFonts w:ascii="Calibri" w:hAnsi="Calibri" w:cs="Calibri"/>
+        </w:rPr>
+      </w:pPr>
+      <w:proofErr w:type="gramStart"/>
+      <w:r>
+        <w:rPr>
+          <w:rFonts w:ascii="Calibri" w:hAnsi="Calibri" w:cs="Calibri"/>
+        </w:rPr>
+        <w:t>Correct :</w:t>
+      </w:r>
+      <w:proofErr w:type="gramEnd"/>
+      <w:r>
+        <w:rPr>
+          <w:rFonts w:ascii="Calibri" w:hAnsi="Calibri" w:cs="Calibri"/>
+        </w:rPr>
+        <w:t>: no</w:t>
+      </w:r>
+    </w:p>
+    <w:p>
+      <w:pPr>
+        <w:rPr>
+          <w:rFonts w:ascii="Calibri" w:hAnsi="Calibri" w:cs="Calibri"/>
+        </w:rPr>
+      </w:pPr>
+    </w:p>
+    <w:p>
+      <w:pPr>
+        <w:rPr>
+          <w:rFonts w:ascii="Calibri" w:hAnsi="Calibri" w:cs="Calibri"/>
+        </w:rPr>
+      </w:pPr>
+      <w:r>
+        <w:rPr>
+          <w:rFonts w:ascii="Calibri" w:hAnsi="Calibri" w:cs="Calibri"/>
+        </w:rPr>
+        <w:t>The following code only selects readings above 140:</w:t>
+      </w:r>
+    </w:p>
+    <w:p>
+      <w:pPr>
+        <w:rPr>
+          <w:rFonts w:ascii="Calibri" w:hAnsi="Calibri" w:cs="Calibri"/>
+        </w:rPr>
+      </w:pPr>
+    </w:p>
+    <w:p>
+      <w:pPr>
+        <w:rPr>
+          <w:rFonts w:ascii="Calibri" w:hAnsi="Calibri" w:cs="Calibri"/>
+        </w:rPr>
+      </w:pPr>
+      <w:r>
+        <w:rPr>
+          <w:rFonts w:ascii="Calibri" w:hAnsi="Calibri" w:cs="Calibri"/>
+        </w:rPr>
+        <w:t>R Example</w:t>
+      </w:r>
+    </w:p>
+    <w:p>
+      <w:pPr>
+        <w:rPr>
+          <w:rFonts w:ascii="Calibri" w:hAnsi="Calibri" w:cs="Calibri"/>
+        </w:rPr>
+      </w:pPr>
+      <w:r>
+        <w:rPr>
+          <w:rFonts w:ascii="Calibri" w:hAnsi="Calibri" w:cs="Calibri"/>
+        </w:rPr>
+        <w:t xml:space="preserve">R </w:t>
+      </w:r>
+      <w:proofErr w:type="gramStart"/>
+      <w:r>
+        <w:rPr>
+          <w:rFonts w:ascii="Calibri" w:hAnsi="Calibri" w:cs="Calibri"/>
+        </w:rPr>
+        <w:t>Mode :</w:t>
+      </w:r>
+      <w:proofErr w:type="gramEnd"/>
+      <w:r>
+        <w:rPr>
+          <w:rFonts w:ascii="Calibri" w:hAnsi="Calibri" w:cs="Calibri"/>
+        </w:rPr>
+        <w:t>: static</w:t>
+      </w:r>
+    </w:p>
+    <w:p>
+      <w:pPr>
+        <w:rPr>
+          <w:rFonts w:ascii="Calibri" w:hAnsi="Calibri" w:cs="Calibri"/>
+        </w:rPr>
+      </w:pPr>
+      <w:proofErr w:type="gramStart"/>
+      <w:r>
+        <w:rPr>
+          <w:rFonts w:ascii="Calibri" w:hAnsi="Calibri" w:cs="Calibri"/>
+        </w:rPr>
+        <w:t>Echo :</w:t>
+      </w:r>
+      <w:proofErr w:type="gramEnd"/>
+      <w:r>
+        <w:rPr>
+          <w:rFonts w:ascii="Calibri" w:hAnsi="Calibri" w:cs="Calibri"/>
+        </w:rPr>
+        <w:t>: true</w:t>
+      </w:r>
+    </w:p>
+    <w:p>
+      <w:pPr>
+        <w:rPr>
+          <w:rFonts w:ascii="Calibri" w:hAnsi="Calibri" w:cs="Calibri"/>
+        </w:rPr>
+      </w:pPr>
+      <w:proofErr w:type="gramStart"/>
+      <w:r>
+        <w:rPr>
+          <w:rFonts w:ascii="Calibri" w:hAnsi="Calibri" w:cs="Calibri"/>
+        </w:rPr>
+        <w:t>Output :</w:t>
+      </w:r>
+      <w:proofErr w:type="gramEnd"/>
+      <w:r>
+        <w:rPr>
+          <w:rFonts w:ascii="Calibri" w:hAnsi="Calibri" w:cs="Calibri"/>
+        </w:rPr>
+        <w:t>: false</w:t>
+      </w:r>
+    </w:p>
+    <w:p>
+      <w:pPr>
+        <w:rPr>
+          <w:rFonts w:ascii="Calibri" w:hAnsi="Calibri" w:cs="Calibri"/>
+        </w:rPr>
+      </w:pPr>
+    </w:p>
+    <w:p>
+      <w:pPr>
+        <w:rPr>
+          <w:rFonts w:ascii="Calibri" w:hAnsi="Calibri" w:cs="Calibri"/>
+        </w:rPr>
+      </w:pPr>
+      <w:r>
+        <w:rPr>
+          <w:rFonts w:ascii="Calibri" w:hAnsi="Calibri" w:cs="Calibri"/>
+        </w:rPr>
+        <w:t>patients |&gt;</w:t>
+      </w:r>
+    </w:p>
+    <w:p>
+      <w:pPr>
+        <w:rPr>
+          <w:rFonts w:ascii="Calibri" w:hAnsi="Calibri" w:cs="Calibri"/>
+        </w:rPr>
+      </w:pPr>
+      <w:r>
+        <w:rPr>
+          <w:rFonts w:ascii="Calibri" w:hAnsi="Calibri" w:cs="Calibri"/>
+        </w:rPr>
+        <w:t xml:space="preserve">  </w:t>
+      </w:r>
+      <w:proofErr w:type="spellStart"/>
+      <w:proofErr w:type="gramStart"/>
+      <w:r>
+        <w:rPr>
+          <w:rFonts w:ascii="Calibri" w:hAnsi="Calibri" w:cs="Calibri"/>
+        </w:rPr>
+        <w:t>dplyr</w:t>
+      </w:r>
+      <w:proofErr w:type="spellEnd"/>
+      <w:r>
+        <w:rPr>
+          <w:rFonts w:ascii="Calibri" w:hAnsi="Calibri" w:cs="Calibri"/>
+        </w:rPr>
+        <w:t>::filter(</w:t>
+      </w:r>
+      <w:proofErr w:type="spellStart"/>
+      <w:proofErr w:type="gramEnd"/>
+      <w:r>
+        <w:rPr>
+          <w:rFonts w:ascii="Calibri" w:hAnsi="Calibri" w:cs="Calibri"/>
+        </w:rPr>
+        <w:t>systolic_bp</w:t>
+      </w:r>
+      <w:proofErr w:type="spellEnd"/>
+      <w:r>
+        <w:rPr>
+          <w:rFonts w:ascii="Calibri" w:hAnsi="Calibri" w:cs="Calibri"/>
+        </w:rPr>
+        <w:t xml:space="preserve"> &gt; 140)</w:t>
+      </w:r>
+    </w:p>
+    <w:p>
+      <w:pPr>
+        <w:rPr>
+          <w:rFonts w:ascii="Calibri" w:hAnsi="Calibri" w:cs="Calibri"/>
+        </w:rPr>
+      </w:pPr>
+    </w:p>
+    <w:p>
+      <w:pPr>
+        <w:rPr>
+          <w:rFonts w:ascii="Calibri" w:hAnsi="Calibri" w:cs="Calibri"/>
+        </w:rPr>
+      </w:pPr>
+      <w:r>
+        <w:rPr>
+          <w:rFonts w:ascii="Calibri" w:hAnsi="Calibri" w:cs="Calibri"/>
+        </w:rPr>
+        <w:t>END R Example</w:t>
+      </w:r>
+    </w:p>
+    <w:p>
+      <w:pPr>
+        <w:rPr>
+          <w:rFonts w:ascii="Calibri" w:hAnsi="Calibri" w:cs="Calibri"/>
+        </w:rPr>
+      </w:pPr>
+    </w:p>
+    <w:p>
+      <w:pPr>
+        <w:rPr>
+          <w:rFonts w:ascii="Calibri" w:hAnsi="Calibri" w:cs="Calibri"/>
+        </w:rPr>
+      </w:pPr>
+      <w:proofErr w:type="gramStart"/>
+      <w:r>
+        <w:rPr>
+          <w:rFonts w:ascii="Calibri" w:hAnsi="Calibri" w:cs="Calibri"/>
+        </w:rPr>
+        <w:t>Feedback :</w:t>
+      </w:r>
+      <w:proofErr w:type="gramEnd"/>
+      <w:r>
+        <w:rPr>
+          <w:rFonts w:ascii="Calibri" w:hAnsi="Calibri" w:cs="Calibri"/>
+        </w:rPr>
+        <w:t>: Not quite. This excludes patients whose systolic blood pressure is exactly 140 mmHg.</w:t>
+      </w:r>
+    </w:p>
+    <w:p>
+      <w:pPr>
+        <w:rPr>
+          <w:rFonts w:ascii="Calibri" w:hAnsi="Calibri" w:cs="Calibri"/>
+        </w:rPr>
+      </w:pPr>
+    </w:p>
+    <w:p>
+      <w:pPr>
+        <w:rPr>
+          <w:rFonts w:ascii="Calibri" w:hAnsi="Calibri" w:cs="Calibri"/>
+        </w:rPr>
+      </w:pPr>
+      <w:r>
+        <w:rPr>
+          <w:rFonts w:ascii="Calibri" w:hAnsi="Calibri" w:cs="Calibri"/>
+        </w:rPr>
+        <w:t>END Option</w:t>
+      </w:r>
+    </w:p>
+    <w:p>
+      <w:pPr>
+        <w:rPr>
+          <w:rFonts w:ascii="Calibri" w:hAnsi="Calibri" w:cs="Calibri"/>
+        </w:rPr>
+      </w:pPr>
+    </w:p>
+    <w:p>
+      <w:pPr>
+        <w:rPr>
+          <w:rFonts w:ascii="Calibri" w:hAnsi="Calibri" w:cs="Calibri"/>
+        </w:rPr>
+      </w:pPr>
+      <w:proofErr w:type="gramStart"/>
+      <w:r>
+        <w:rPr>
+          <w:rFonts w:ascii="Calibri" w:hAnsi="Calibri" w:cs="Calibri"/>
+        </w:rPr>
+        <w:t>Hint :</w:t>
+      </w:r>
+      <w:proofErr w:type="gramEnd"/>
+      <w:r>
+        <w:rPr>
+          <w:rFonts w:ascii="Calibri" w:hAnsi="Calibri" w:cs="Calibri"/>
+        </w:rPr>
+        <w:t>: Look for the operator that means greater than or equal to.</w:t>
+      </w:r>
+    </w:p>
+    <w:p>
+      <w:pPr>
+        <w:rPr>
+          <w:rFonts w:ascii="Calibri" w:hAnsi="Calibri" w:cs="Calibri"/>
+        </w:rPr>
+      </w:pPr>
+    </w:p>
+    <w:p>
+      <w:pPr>
+        <w:rPr>
+          <w:rFonts w:ascii="Calibri" w:hAnsi="Calibri" w:cs="Calibri"/>
+        </w:rPr>
+      </w:pPr>
+      <w:proofErr w:type="gramStart"/>
+      <w:r>
+        <w:rPr>
+          <w:rFonts w:ascii="Calibri" w:hAnsi="Calibri" w:cs="Calibri"/>
+        </w:rPr>
+        <w:t>Explanation :</w:t>
+      </w:r>
+      <w:proofErr w:type="gramEnd"/>
+      <w:r>
+        <w:rPr>
+          <w:rFonts w:ascii="Calibri" w:hAnsi="Calibri" w:cs="Calibri"/>
+        </w:rPr>
+        <w:t xml:space="preserve">: The correct expression is </w:t>
+      </w:r>
+      <w:proofErr w:type="spellStart"/>
+      <w:r>
+        <w:rPr>
+          <w:rFonts w:ascii="Calibri" w:hAnsi="Calibri" w:cs="Calibri"/>
+        </w:rPr>
+        <w:t>systolic_bp</w:t>
+      </w:r>
+      <w:proofErr w:type="spellEnd"/>
+      <w:r>
+        <w:rPr>
+          <w:rFonts w:ascii="Calibri" w:hAnsi="Calibri" w:cs="Calibri"/>
+        </w:rPr>
+        <w:t xml:space="preserve"> &gt;= 140.</w:t>
+      </w:r>
+    </w:p>
+    <w:p>
+      <w:pPr>
+        <w:rPr>
+          <w:rFonts w:ascii="Calibri" w:hAnsi="Calibri" w:cs="Calibri"/>
+        </w:rPr>
+      </w:pPr>
+    </w:p>
+    <w:p>
+      <w:pPr>
+        <w:rPr>
+          <w:rFonts w:ascii="Calibri" w:hAnsi="Calibri" w:cs="Calibri"/>
+        </w:rPr>
+      </w:pPr>
+      <w:r>
+        <w:rPr>
+          <w:rFonts w:ascii="Calibri" w:hAnsi="Calibri" w:cs="Calibri"/>
+        </w:rPr>
+        <w:t>The &gt;= operator includes values greater than 140 and values equal to 140. This makes it appropriate when 140 mmHg is part of the threshold.</w:t>
+      </w:r>
+    </w:p>
+    <w:p>
+      <w:pPr>
+        <w:rPr>
+          <w:rFonts w:ascii="Calibri" w:hAnsi="Calibri" w:cs="Calibri"/>
+        </w:rPr>
+      </w:pPr>
+    </w:p>
+    <w:p>
+      <w:pPr>
+        <w:rPr>
+          <w:rFonts w:ascii="Calibri" w:hAnsi="Calibri" w:cs="Calibri"/>
+        </w:rPr>
+      </w:pPr>
+      <w:r>
+        <w:rPr>
+          <w:rFonts w:ascii="Calibri" w:hAnsi="Calibri" w:cs="Calibri"/>
+        </w:rPr>
+        <w:t>END Quiz</w:t>
       </w:r>
       <w:r>
         <w:rPr>
           <w:rFonts w:ascii="Calibri" w:hAnsi="Calibri" w:cs="Calibri"/>
         </w:rPr>
         <w:br/>
-        <w:t>Label :: View full outbreak investigation report</w:t>
       </w:r>
     </w:p>
     <w:p>
@@ -3377,58 +4566,1487 @@
         <w:rPr>
           <w:rFonts w:ascii="Calibri" w:hAnsi="Calibri" w:cs="Calibri"/>
         </w:rPr>
-        <w:t>Download Dataset</w:t>
-      </w:r>
-    </w:p>
-    <w:p>
-      <w:pPr>
-        <w:rPr>
-          <w:rFonts w:ascii="Calibri" w:hAnsi="Calibri" w:cs="Calibri"/>
-        </w:rPr>
-      </w:pPr>
-    </w:p>
-    <w:p>
-      <w:pPr>
-        <w:rPr>
-          <w:rFonts w:ascii="Calibri" w:hAnsi="Calibri" w:cs="Calibri"/>
-        </w:rPr>
-      </w:pPr>
-      <w:proofErr w:type="gramStart"/>
-      <w:r>
-        <w:rPr>
-          <w:rFonts w:ascii="Calibri" w:hAnsi="Calibri" w:cs="Calibri"/>
-        </w:rPr>
-        <w:t>File :</w:t>
-      </w:r>
-      <w:proofErr w:type="gramEnd"/>
-      <w:r>
-        <w:rPr>
-          <w:rFonts w:ascii="Calibri" w:hAnsi="Calibri" w:cs="Calibri"/>
-        </w:rPr>
-        <w:t>: resources/data/outbreak-dataset.zip</w:t>
-      </w:r>
-      <w:r>
-        <w:rPr>
-          <w:rFonts w:ascii="Calibri" w:hAnsi="Calibri" w:cs="Calibri"/>
-        </w:rPr>
+        <w:t xml:space="preserve">Single </w:t>
+      </w:r>
+      <w:r>
+        <w:rPr>
+          <w:rFonts w:ascii="Calibri" w:hAnsi="Calibri" w:cs="Calibri"/>
+        </w:rPr>
+        <w:t>Quiz</w:t>
+      </w:r>
+    </w:p>
+    <w:p>
+      <w:pPr>
+        <w:rPr>
+          <w:rFonts w:ascii="Calibri" w:hAnsi="Calibri" w:cs="Calibri"/>
+        </w:rPr>
+      </w:pPr>
+    </w:p>
+    <w:p>
+      <w:pPr>
+        <w:rPr>
+          <w:rFonts w:ascii="Calibri" w:hAnsi="Calibri" w:cs="Calibri"/>
+        </w:rPr>
+      </w:pPr>
+      <w:r>
+        <w:rPr>
+          <w:rFonts w:ascii="Calibri" w:hAnsi="Calibri" w:cs="Calibri"/>
+        </w:rPr>
+        <w:t>Quiz</w:t>
+      </w:r>
+    </w:p>
+    <w:p>
+      <w:pPr>
+        <w:rPr>
+          <w:rFonts w:ascii="Calibri" w:hAnsi="Calibri" w:cs="Calibri"/>
+        </w:rPr>
+      </w:pPr>
+      <w:proofErr w:type="gramStart"/>
+      <w:r>
+        <w:rPr>
+          <w:rFonts w:ascii="Calibri" w:hAnsi="Calibri" w:cs="Calibri"/>
+        </w:rPr>
+        <w:t>Type :</w:t>
+      </w:r>
+      <w:proofErr w:type="gramEnd"/>
+      <w:r>
+        <w:rPr>
+          <w:rFonts w:ascii="Calibri" w:hAnsi="Calibri" w:cs="Calibri"/>
+        </w:rPr>
+        <w:t>: single</w:t>
+      </w:r>
+    </w:p>
+    <w:p>
+      <w:pPr>
+        <w:rPr>
+          <w:rFonts w:ascii="Calibri" w:hAnsi="Calibri" w:cs="Calibri"/>
+        </w:rPr>
+      </w:pPr>
+      <w:proofErr w:type="gramStart"/>
+      <w:r>
+        <w:rPr>
+          <w:rFonts w:ascii="Calibri" w:hAnsi="Calibri" w:cs="Calibri"/>
+        </w:rPr>
+        <w:t>Question :</w:t>
+      </w:r>
+      <w:proofErr w:type="gramEnd"/>
+      <w:r>
+        <w:rPr>
+          <w:rFonts w:ascii="Calibri" w:hAnsi="Calibri" w:cs="Calibri"/>
+        </w:rPr>
+        <w:t>: Which expression correctly calculates vaccine effectiveness from a risk ratio?</w:t>
+      </w:r>
+    </w:p>
+    <w:p>
+      <w:pPr>
+        <w:rPr>
+          <w:rFonts w:ascii="Calibri" w:hAnsi="Calibri" w:cs="Calibri"/>
+        </w:rPr>
+      </w:pPr>
+    </w:p>
+    <w:p>
+      <w:pPr>
+        <w:rPr>
+          <w:rFonts w:ascii="Calibri" w:hAnsi="Calibri" w:cs="Calibri"/>
+        </w:rPr>
+      </w:pPr>
+      <w:r>
+        <w:rPr>
+          <w:rFonts w:ascii="Calibri" w:hAnsi="Calibri" w:cs="Calibri"/>
+        </w:rPr>
+        <w:t>Option</w:t>
+      </w:r>
+    </w:p>
+    <w:p>
+      <w:pPr>
+        <w:rPr>
+          <w:rFonts w:ascii="Calibri" w:hAnsi="Calibri" w:cs="Calibri"/>
+        </w:rPr>
+      </w:pPr>
+      <w:proofErr w:type="gramStart"/>
+      <w:r>
+        <w:rPr>
+          <w:rFonts w:ascii="Calibri" w:hAnsi="Calibri" w:cs="Calibri"/>
+        </w:rPr>
+        <w:t>Correct :</w:t>
+      </w:r>
+      <w:proofErr w:type="gramEnd"/>
+      <w:r>
+        <w:rPr>
+          <w:rFonts w:ascii="Calibri" w:hAnsi="Calibri" w:cs="Calibri"/>
+        </w:rPr>
+        <w:t>: yes</w:t>
+      </w:r>
+    </w:p>
+    <w:p>
+      <w:pPr>
+        <w:rPr>
+          <w:rFonts w:ascii="Calibri" w:hAnsi="Calibri" w:cs="Calibri"/>
+        </w:rPr>
+      </w:pPr>
+    </w:p>
+    <w:p>
+      <w:pPr>
+        <w:rPr>
+          <w:rFonts w:ascii="Calibri" w:hAnsi="Calibri" w:cs="Calibri"/>
+        </w:rPr>
+      </w:pPr>
+      <w:r>
+        <w:rPr>
+          <w:rFonts w:ascii="Calibri" w:hAnsi="Calibri" w:cs="Calibri"/>
+        </w:rPr>
+        <w:t>Vaccine effectiveness is calculated as:</w:t>
+      </w:r>
+    </w:p>
+    <w:p>
+      <w:pPr>
+        <w:rPr>
+          <w:rFonts w:ascii="Calibri" w:hAnsi="Calibri" w:cs="Calibri"/>
+        </w:rPr>
+      </w:pPr>
+    </w:p>
+    <w:p>
+      <w:pPr>
+        <w:rPr>
+          <w:rFonts w:ascii="Calibri" w:hAnsi="Calibri" w:cs="Calibri"/>
+        </w:rPr>
+      </w:pPr>
+      <w:r>
+        <w:rPr>
+          <w:rFonts w:ascii="Calibri" w:hAnsi="Calibri" w:cs="Calibri"/>
+        </w:rPr>
+        <w:t>$$</w:t>
+      </w:r>
+    </w:p>
+    <w:p>
+      <w:pPr>
+        <w:rPr>
+          <w:rFonts w:ascii="Calibri" w:hAnsi="Calibri" w:cs="Calibri"/>
+        </w:rPr>
+      </w:pPr>
+      <w:r>
+        <w:rPr>
+          <w:rFonts w:ascii="Calibri" w:hAnsi="Calibri" w:cs="Calibri"/>
+        </w:rPr>
+        <w:t>VE = (1-</w:t>
+      </w:r>
+      <w:proofErr w:type="gramStart"/>
+      <w:r>
+        <w:rPr>
+          <w:rFonts w:ascii="Calibri" w:hAnsi="Calibri" w:cs="Calibri"/>
+        </w:rPr>
+        <w:t>RR)\</w:t>
+      </w:r>
+      <w:proofErr w:type="gramEnd"/>
+      <w:r>
+        <w:rPr>
+          <w:rFonts w:ascii="Calibri" w:hAnsi="Calibri" w:cs="Calibri"/>
+        </w:rPr>
+        <w:t>times 100</w:t>
+      </w:r>
+    </w:p>
+    <w:p>
+      <w:pPr>
+        <w:rPr>
+          <w:rFonts w:ascii="Calibri" w:hAnsi="Calibri" w:cs="Calibri"/>
+        </w:rPr>
+      </w:pPr>
+      <w:r>
+        <w:rPr>
+          <w:rFonts w:ascii="Calibri" w:hAnsi="Calibri" w:cs="Calibri"/>
+        </w:rPr>
+        <w:t>$$</w:t>
+      </w:r>
+    </w:p>
+    <w:p>
+      <w:pPr>
+        <w:rPr>
+          <w:rFonts w:ascii="Calibri" w:hAnsi="Calibri" w:cs="Calibri"/>
+        </w:rPr>
+      </w:pPr>
+    </w:p>
+    <w:p>
+      <w:pPr>
+        <w:rPr>
+          <w:rFonts w:ascii="Calibri" w:hAnsi="Calibri" w:cs="Calibri"/>
+        </w:rPr>
+      </w:pPr>
+      <w:r>
+        <w:rPr>
+          <w:rFonts w:ascii="Calibri" w:hAnsi="Calibri" w:cs="Calibri"/>
+        </w:rPr>
+        <w:t>where \(RR\) is the risk ratio comparing vaccinated and unvaccinated groups.</w:t>
+      </w:r>
+    </w:p>
+    <w:p>
+      <w:pPr>
+        <w:rPr>
+          <w:rFonts w:ascii="Calibri" w:hAnsi="Calibri" w:cs="Calibri"/>
+        </w:rPr>
+      </w:pPr>
+    </w:p>
+    <w:p>
+      <w:pPr>
+        <w:rPr>
+          <w:rFonts w:ascii="Calibri" w:hAnsi="Calibri" w:cs="Calibri"/>
+        </w:rPr>
+      </w:pPr>
+      <w:proofErr w:type="gramStart"/>
+      <w:r>
+        <w:rPr>
+          <w:rFonts w:ascii="Calibri" w:hAnsi="Calibri" w:cs="Calibri"/>
+        </w:rPr>
+        <w:t>Feedback :</w:t>
+      </w:r>
+      <w:proofErr w:type="gramEnd"/>
+      <w:r>
+        <w:rPr>
+          <w:rFonts w:ascii="Calibri" w:hAnsi="Calibri" w:cs="Calibri"/>
+        </w:rPr>
+        <w:t>: Correct. Vaccine effectiveness represents the proportional reduction in risk associated with vaccination.</w:t>
+      </w:r>
+    </w:p>
+    <w:p>
+      <w:pPr>
+        <w:rPr>
+          <w:rFonts w:ascii="Calibri" w:hAnsi="Calibri" w:cs="Calibri"/>
+        </w:rPr>
+      </w:pPr>
+    </w:p>
+    <w:p>
+      <w:pPr>
+        <w:rPr>
+          <w:rFonts w:ascii="Calibri" w:hAnsi="Calibri" w:cs="Calibri"/>
+        </w:rPr>
+      </w:pPr>
+      <w:r>
+        <w:rPr>
+          <w:rFonts w:ascii="Calibri" w:hAnsi="Calibri" w:cs="Calibri"/>
+        </w:rPr>
+        <w:t>For example, if \(RR=0.30\), then \(VE=70\%\).</w:t>
+      </w:r>
+    </w:p>
+    <w:p>
+      <w:pPr>
+        <w:rPr>
+          <w:rFonts w:ascii="Calibri" w:hAnsi="Calibri" w:cs="Calibri"/>
+        </w:rPr>
+      </w:pPr>
+    </w:p>
+    <w:p>
+      <w:pPr>
+        <w:rPr>
+          <w:rFonts w:ascii="Calibri" w:hAnsi="Calibri" w:cs="Calibri"/>
+        </w:rPr>
+      </w:pPr>
+      <w:r>
+        <w:rPr>
+          <w:rFonts w:ascii="Calibri" w:hAnsi="Calibri" w:cs="Calibri"/>
+        </w:rPr>
+        <w:t>END Option</w:t>
+      </w:r>
+    </w:p>
+    <w:p>
+      <w:pPr>
+        <w:rPr>
+          <w:rFonts w:ascii="Calibri" w:hAnsi="Calibri" w:cs="Calibri"/>
+        </w:rPr>
+      </w:pPr>
+    </w:p>
+    <w:p>
+      <w:pPr>
+        <w:rPr>
+          <w:rFonts w:ascii="Calibri" w:hAnsi="Calibri" w:cs="Calibri"/>
+        </w:rPr>
+      </w:pPr>
+      <w:r>
+        <w:rPr>
+          <w:rFonts w:ascii="Calibri" w:hAnsi="Calibri" w:cs="Calibri"/>
+        </w:rPr>
+        <w:t>Option</w:t>
+      </w:r>
+    </w:p>
+    <w:p>
+      <w:pPr>
+        <w:rPr>
+          <w:rFonts w:ascii="Calibri" w:hAnsi="Calibri" w:cs="Calibri"/>
+        </w:rPr>
+      </w:pPr>
+      <w:proofErr w:type="gramStart"/>
+      <w:r>
+        <w:rPr>
+          <w:rFonts w:ascii="Calibri" w:hAnsi="Calibri" w:cs="Calibri"/>
+        </w:rPr>
+        <w:t>Correct :</w:t>
+      </w:r>
+      <w:proofErr w:type="gramEnd"/>
+      <w:r>
+        <w:rPr>
+          <w:rFonts w:ascii="Calibri" w:hAnsi="Calibri" w:cs="Calibri"/>
+        </w:rPr>
+        <w:t>: no</w:t>
+      </w:r>
+    </w:p>
+    <w:p>
+      <w:pPr>
+        <w:rPr>
+          <w:rFonts w:ascii="Calibri" w:hAnsi="Calibri" w:cs="Calibri"/>
+        </w:rPr>
+      </w:pPr>
+    </w:p>
+    <w:p>
+      <w:pPr>
+        <w:rPr>
+          <w:rFonts w:ascii="Calibri" w:hAnsi="Calibri" w:cs="Calibri"/>
+        </w:rPr>
+      </w:pPr>
+      <w:r>
+        <w:rPr>
+          <w:rFonts w:ascii="Calibri" w:hAnsi="Calibri" w:cs="Calibri"/>
+        </w:rPr>
+        <w:t>Vaccine effectiveness is the risk ratio multiplied by 100:</w:t>
+      </w:r>
+    </w:p>
+    <w:p>
+      <w:pPr>
+        <w:rPr>
+          <w:rFonts w:ascii="Calibri" w:hAnsi="Calibri" w:cs="Calibri"/>
+        </w:rPr>
+      </w:pPr>
+    </w:p>
+    <w:p>
+      <w:pPr>
+        <w:rPr>
+          <w:rFonts w:ascii="Calibri" w:hAnsi="Calibri" w:cs="Calibri"/>
+        </w:rPr>
+      </w:pPr>
+      <w:r>
+        <w:rPr>
+          <w:rFonts w:ascii="Calibri" w:hAnsi="Calibri" w:cs="Calibri"/>
+        </w:rPr>
+        <w:t>$$</w:t>
+      </w:r>
+    </w:p>
+    <w:p>
+      <w:pPr>
+        <w:rPr>
+          <w:rFonts w:ascii="Calibri" w:hAnsi="Calibri" w:cs="Calibri"/>
+        </w:rPr>
+      </w:pPr>
+      <w:r>
+        <w:rPr>
+          <w:rFonts w:ascii="Calibri" w:hAnsi="Calibri" w:cs="Calibri"/>
+        </w:rPr>
+        <w:t>VE = RR\times 100</w:t>
+      </w:r>
+    </w:p>
+    <w:p>
+      <w:pPr>
+        <w:rPr>
+          <w:rFonts w:ascii="Calibri" w:hAnsi="Calibri" w:cs="Calibri"/>
+        </w:rPr>
+      </w:pPr>
+      <w:r>
+        <w:rPr>
+          <w:rFonts w:ascii="Calibri" w:hAnsi="Calibri" w:cs="Calibri"/>
+        </w:rPr>
+        <w:t>$$</w:t>
+      </w:r>
+    </w:p>
+    <w:p>
+      <w:pPr>
+        <w:rPr>
+          <w:rFonts w:ascii="Calibri" w:hAnsi="Calibri" w:cs="Calibri"/>
+        </w:rPr>
+      </w:pPr>
+    </w:p>
+    <w:p>
+      <w:pPr>
+        <w:rPr>
+          <w:rFonts w:ascii="Calibri" w:hAnsi="Calibri" w:cs="Calibri"/>
+        </w:rPr>
+      </w:pPr>
+      <w:proofErr w:type="gramStart"/>
+      <w:r>
+        <w:rPr>
+          <w:rFonts w:ascii="Calibri" w:hAnsi="Calibri" w:cs="Calibri"/>
+        </w:rPr>
+        <w:t>Feedback :</w:t>
+      </w:r>
+      <w:proofErr w:type="gramEnd"/>
+      <w:r>
+        <w:rPr>
+          <w:rFonts w:ascii="Calibri" w:hAnsi="Calibri" w:cs="Calibri"/>
+        </w:rPr>
+        <w:t>: Not quite. This converts the risk ratio into a percentage but does not calculate the reduction in risk.</w:t>
+      </w:r>
+    </w:p>
+    <w:p>
+      <w:pPr>
+        <w:rPr>
+          <w:rFonts w:ascii="Calibri" w:hAnsi="Calibri" w:cs="Calibri"/>
+        </w:rPr>
+      </w:pPr>
+    </w:p>
+    <w:p>
+      <w:pPr>
+        <w:rPr>
+          <w:rFonts w:ascii="Calibri" w:hAnsi="Calibri" w:cs="Calibri"/>
+        </w:rPr>
+      </w:pPr>
+      <w:r>
+        <w:rPr>
+          <w:rFonts w:ascii="Calibri" w:hAnsi="Calibri" w:cs="Calibri"/>
+        </w:rPr>
+        <w:t>END Option</w:t>
+      </w:r>
+    </w:p>
+    <w:p>
+      <w:pPr>
+        <w:rPr>
+          <w:rFonts w:ascii="Calibri" w:hAnsi="Calibri" w:cs="Calibri"/>
+        </w:rPr>
+      </w:pPr>
+    </w:p>
+    <w:p>
+      <w:pPr>
+        <w:rPr>
+          <w:rFonts w:ascii="Calibri" w:hAnsi="Calibri" w:cs="Calibri"/>
+        </w:rPr>
+      </w:pPr>
+      <w:r>
+        <w:rPr>
+          <w:rFonts w:ascii="Calibri" w:hAnsi="Calibri" w:cs="Calibri"/>
+        </w:rPr>
+        <w:t>Option</w:t>
+      </w:r>
+    </w:p>
+    <w:p>
+      <w:pPr>
+        <w:rPr>
+          <w:rFonts w:ascii="Calibri" w:hAnsi="Calibri" w:cs="Calibri"/>
+        </w:rPr>
+      </w:pPr>
+      <w:proofErr w:type="gramStart"/>
+      <w:r>
+        <w:rPr>
+          <w:rFonts w:ascii="Calibri" w:hAnsi="Calibri" w:cs="Calibri"/>
+        </w:rPr>
+        <w:t>Correct :</w:t>
+      </w:r>
+      <w:proofErr w:type="gramEnd"/>
+      <w:r>
+        <w:rPr>
+          <w:rFonts w:ascii="Calibri" w:hAnsi="Calibri" w:cs="Calibri"/>
+        </w:rPr>
+        <w:t>: no</w:t>
+      </w:r>
+    </w:p>
+    <w:p>
+      <w:pPr>
+        <w:rPr>
+          <w:rFonts w:ascii="Calibri" w:hAnsi="Calibri" w:cs="Calibri"/>
+        </w:rPr>
+      </w:pPr>
+    </w:p>
+    <w:p>
+      <w:pPr>
+        <w:rPr>
+          <w:rFonts w:ascii="Calibri" w:hAnsi="Calibri" w:cs="Calibri"/>
+        </w:rPr>
+      </w:pPr>
+      <w:r>
+        <w:rPr>
+          <w:rFonts w:ascii="Calibri" w:hAnsi="Calibri" w:cs="Calibri"/>
+        </w:rPr>
+        <w:t>Vaccine effectiveness is calculated by subtracting the risk ratio from 100:</w:t>
+      </w:r>
+    </w:p>
+    <w:p>
+      <w:pPr>
+        <w:rPr>
+          <w:rFonts w:ascii="Calibri" w:hAnsi="Calibri" w:cs="Calibri"/>
+        </w:rPr>
+      </w:pPr>
+    </w:p>
+    <w:p>
+      <w:pPr>
+        <w:rPr>
+          <w:rFonts w:ascii="Calibri" w:hAnsi="Calibri" w:cs="Calibri"/>
+        </w:rPr>
+      </w:pPr>
+      <w:r>
+        <w:rPr>
+          <w:rFonts w:ascii="Calibri" w:hAnsi="Calibri" w:cs="Calibri"/>
+        </w:rPr>
+        <w:t>$$</w:t>
+      </w:r>
+    </w:p>
+    <w:p>
+      <w:pPr>
+        <w:rPr>
+          <w:rFonts w:ascii="Calibri" w:hAnsi="Calibri" w:cs="Calibri"/>
+        </w:rPr>
+      </w:pPr>
+      <w:r>
+        <w:rPr>
+          <w:rFonts w:ascii="Calibri" w:hAnsi="Calibri" w:cs="Calibri"/>
+        </w:rPr>
+        <w:t>VE = 100-RR</w:t>
+      </w:r>
+    </w:p>
+    <w:p>
+      <w:pPr>
+        <w:rPr>
+          <w:rFonts w:ascii="Calibri" w:hAnsi="Calibri" w:cs="Calibri"/>
+        </w:rPr>
+      </w:pPr>
+      <w:r>
+        <w:rPr>
+          <w:rFonts w:ascii="Calibri" w:hAnsi="Calibri" w:cs="Calibri"/>
+        </w:rPr>
+        <w:t>$$</w:t>
+      </w:r>
+    </w:p>
+    <w:p>
+      <w:pPr>
+        <w:rPr>
+          <w:rFonts w:ascii="Calibri" w:hAnsi="Calibri" w:cs="Calibri"/>
+        </w:rPr>
+      </w:pPr>
+    </w:p>
+    <w:p>
+      <w:pPr>
+        <w:rPr>
+          <w:rFonts w:ascii="Calibri" w:hAnsi="Calibri" w:cs="Calibri"/>
+        </w:rPr>
+      </w:pPr>
+      <w:proofErr w:type="gramStart"/>
+      <w:r>
+        <w:rPr>
+          <w:rFonts w:ascii="Calibri" w:hAnsi="Calibri" w:cs="Calibri"/>
+        </w:rPr>
+        <w:t>Feedback :</w:t>
+      </w:r>
+      <w:proofErr w:type="gramEnd"/>
+      <w:r>
+        <w:rPr>
+          <w:rFonts w:ascii="Calibri" w:hAnsi="Calibri" w:cs="Calibri"/>
+        </w:rPr>
+        <w:t>: Not quite. The risk ratio is normally expressed as a proportion and must first be subtracted from 1.</w:t>
+      </w:r>
+    </w:p>
+    <w:p>
+      <w:pPr>
+        <w:rPr>
+          <w:rFonts w:ascii="Calibri" w:hAnsi="Calibri" w:cs="Calibri"/>
+        </w:rPr>
+      </w:pPr>
+    </w:p>
+    <w:p>
+      <w:pPr>
+        <w:rPr>
+          <w:rFonts w:ascii="Calibri" w:hAnsi="Calibri" w:cs="Calibri"/>
+        </w:rPr>
+      </w:pPr>
+      <w:r>
+        <w:rPr>
+          <w:rFonts w:ascii="Calibri" w:hAnsi="Calibri" w:cs="Calibri"/>
+        </w:rPr>
+        <w:t>END Option</w:t>
+      </w:r>
+    </w:p>
+    <w:p>
+      <w:pPr>
+        <w:rPr>
+          <w:rFonts w:ascii="Calibri" w:hAnsi="Calibri" w:cs="Calibri"/>
+        </w:rPr>
+      </w:pPr>
+    </w:p>
+    <w:p>
+      <w:pPr>
+        <w:rPr>
+          <w:rFonts w:ascii="Calibri" w:hAnsi="Calibri" w:cs="Calibri"/>
+        </w:rPr>
+      </w:pPr>
+      <w:proofErr w:type="gramStart"/>
+      <w:r>
+        <w:rPr>
+          <w:rFonts w:ascii="Calibri" w:hAnsi="Calibri" w:cs="Calibri"/>
+        </w:rPr>
+        <w:t>Hint :</w:t>
+      </w:r>
+      <w:proofErr w:type="gramEnd"/>
+      <w:r>
+        <w:rPr>
+          <w:rFonts w:ascii="Calibri" w:hAnsi="Calibri" w:cs="Calibri"/>
+        </w:rPr>
+        <w:t>: Vaccine effectiveness measures the proportional reduction in risk among vaccinated people.</w:t>
+      </w:r>
+    </w:p>
+    <w:p>
+      <w:pPr>
+        <w:rPr>
+          <w:rFonts w:ascii="Calibri" w:hAnsi="Calibri" w:cs="Calibri"/>
+        </w:rPr>
+      </w:pPr>
+    </w:p>
+    <w:p>
+      <w:pPr>
+        <w:rPr>
+          <w:rFonts w:ascii="Calibri" w:hAnsi="Calibri" w:cs="Calibri"/>
+        </w:rPr>
+      </w:pPr>
+      <w:proofErr w:type="gramStart"/>
+      <w:r>
+        <w:rPr>
+          <w:rFonts w:ascii="Calibri" w:hAnsi="Calibri" w:cs="Calibri"/>
+        </w:rPr>
+        <w:t>Explanation :</w:t>
+      </w:r>
+      <w:proofErr w:type="gramEnd"/>
+      <w:r>
+        <w:rPr>
+          <w:rFonts w:ascii="Calibri" w:hAnsi="Calibri" w:cs="Calibri"/>
+        </w:rPr>
+        <w:t>: The correct formula is:</w:t>
+      </w:r>
+    </w:p>
+    <w:p>
+      <w:pPr>
+        <w:rPr>
+          <w:rFonts w:ascii="Calibri" w:hAnsi="Calibri" w:cs="Calibri"/>
+        </w:rPr>
+      </w:pPr>
+    </w:p>
+    <w:p>
+      <w:pPr>
+        <w:rPr>
+          <w:rFonts w:ascii="Calibri" w:hAnsi="Calibri" w:cs="Calibri"/>
+        </w:rPr>
+      </w:pPr>
+      <w:r>
+        <w:rPr>
+          <w:rFonts w:ascii="Calibri" w:hAnsi="Calibri" w:cs="Calibri"/>
+        </w:rPr>
+        <w:t>$$</w:t>
+      </w:r>
+    </w:p>
+    <w:p>
+      <w:pPr>
+        <w:rPr>
+          <w:rFonts w:ascii="Calibri" w:hAnsi="Calibri" w:cs="Calibri"/>
+        </w:rPr>
+      </w:pPr>
+      <w:r>
+        <w:rPr>
+          <w:rFonts w:ascii="Calibri" w:hAnsi="Calibri" w:cs="Calibri"/>
+        </w:rPr>
+        <w:t>VE = (1-</w:t>
+      </w:r>
+      <w:proofErr w:type="gramStart"/>
+      <w:r>
+        <w:rPr>
+          <w:rFonts w:ascii="Calibri" w:hAnsi="Calibri" w:cs="Calibri"/>
+        </w:rPr>
+        <w:t>RR)\</w:t>
+      </w:r>
+      <w:proofErr w:type="gramEnd"/>
+      <w:r>
+        <w:rPr>
+          <w:rFonts w:ascii="Calibri" w:hAnsi="Calibri" w:cs="Calibri"/>
+        </w:rPr>
+        <w:t>times 100</w:t>
+      </w:r>
+    </w:p>
+    <w:p>
+      <w:pPr>
+        <w:rPr>
+          <w:rFonts w:ascii="Calibri" w:hAnsi="Calibri" w:cs="Calibri"/>
+        </w:rPr>
+      </w:pPr>
+      <w:r>
+        <w:rPr>
+          <w:rFonts w:ascii="Calibri" w:hAnsi="Calibri" w:cs="Calibri"/>
+        </w:rPr>
+        <w:t>$$</w:t>
+      </w:r>
+    </w:p>
+    <w:p>
+      <w:pPr>
+        <w:rPr>
+          <w:rFonts w:ascii="Calibri" w:hAnsi="Calibri" w:cs="Calibri"/>
+        </w:rPr>
+      </w:pPr>
+    </w:p>
+    <w:p>
+      <w:pPr>
+        <w:rPr>
+          <w:rFonts w:ascii="Calibri" w:hAnsi="Calibri" w:cs="Calibri"/>
+        </w:rPr>
+      </w:pPr>
+      <w:r>
+        <w:rPr>
+          <w:rFonts w:ascii="Calibri" w:hAnsi="Calibri" w:cs="Calibri"/>
+        </w:rPr>
+        <w:lastRenderedPageBreak/>
+        <w:t xml:space="preserve">If the risk ratio is </w:t>
+      </w:r>
+      <w:proofErr w:type="gramStart"/>
+      <w:r>
+        <w:rPr>
+          <w:rFonts w:ascii="Calibri" w:hAnsi="Calibri" w:cs="Calibri"/>
+        </w:rPr>
+        <w:t>\(</w:t>
+      </w:r>
+      <w:proofErr w:type="gramEnd"/>
+      <w:r>
+        <w:rPr>
+          <w:rFonts w:ascii="Calibri" w:hAnsi="Calibri" w:cs="Calibri"/>
+        </w:rPr>
+        <w:t>0.30\), the calculation is:</w:t>
+      </w:r>
+    </w:p>
+    <w:p>
+      <w:pPr>
+        <w:rPr>
+          <w:rFonts w:ascii="Calibri" w:hAnsi="Calibri" w:cs="Calibri"/>
+        </w:rPr>
+      </w:pPr>
+    </w:p>
+    <w:p>
+      <w:pPr>
+        <w:rPr>
+          <w:rFonts w:ascii="Calibri" w:hAnsi="Calibri" w:cs="Calibri"/>
+        </w:rPr>
+      </w:pPr>
+      <w:r>
+        <w:rPr>
+          <w:rFonts w:ascii="Calibri" w:hAnsi="Calibri" w:cs="Calibri"/>
+        </w:rPr>
+        <w:t>$$</w:t>
+      </w:r>
+    </w:p>
+    <w:p>
+      <w:pPr>
+        <w:rPr>
+          <w:rFonts w:ascii="Calibri" w:hAnsi="Calibri" w:cs="Calibri"/>
+        </w:rPr>
+      </w:pPr>
+      <w:r>
+        <w:rPr>
+          <w:rFonts w:ascii="Calibri" w:hAnsi="Calibri" w:cs="Calibri"/>
+        </w:rPr>
+        <w:t>VE = (1-0.</w:t>
+      </w:r>
+      <w:proofErr w:type="gramStart"/>
+      <w:r>
+        <w:rPr>
+          <w:rFonts w:ascii="Calibri" w:hAnsi="Calibri" w:cs="Calibri"/>
+        </w:rPr>
+        <w:t>30)\</w:t>
+      </w:r>
+      <w:proofErr w:type="gramEnd"/>
+      <w:r>
+        <w:rPr>
+          <w:rFonts w:ascii="Calibri" w:hAnsi="Calibri" w:cs="Calibri"/>
+        </w:rPr>
+        <w:t>times 100 = 70\%</w:t>
+      </w:r>
+    </w:p>
+    <w:p>
+      <w:pPr>
+        <w:rPr>
+          <w:rFonts w:ascii="Calibri" w:hAnsi="Calibri" w:cs="Calibri"/>
+        </w:rPr>
+      </w:pPr>
+      <w:r>
+        <w:rPr>
+          <w:rFonts w:ascii="Calibri" w:hAnsi="Calibri" w:cs="Calibri"/>
+        </w:rPr>
+        <w:t>$$</w:t>
+      </w:r>
+    </w:p>
+    <w:p>
+      <w:pPr>
+        <w:rPr>
+          <w:rFonts w:ascii="Calibri" w:hAnsi="Calibri" w:cs="Calibri"/>
+        </w:rPr>
+      </w:pPr>
+    </w:p>
+    <w:p>
+      <w:pPr>
+        <w:rPr>
+          <w:rFonts w:ascii="Calibri" w:hAnsi="Calibri" w:cs="Calibri"/>
+        </w:rPr>
+      </w:pPr>
+      <w:r>
+        <w:rPr>
+          <w:rFonts w:ascii="Calibri" w:hAnsi="Calibri" w:cs="Calibri"/>
+        </w:rPr>
+        <w:t>This indicates that vaccination is associated with a 70% reduction in risk.</w:t>
+      </w:r>
+    </w:p>
+    <w:p>
+      <w:pPr>
+        <w:rPr>
+          <w:rFonts w:ascii="Calibri" w:hAnsi="Calibri" w:cs="Calibri"/>
+        </w:rPr>
+      </w:pPr>
+    </w:p>
+    <w:p>
+      <w:pPr>
+        <w:rPr>
+          <w:rFonts w:ascii="Calibri" w:hAnsi="Calibri" w:cs="Calibri"/>
+        </w:rPr>
+      </w:pPr>
+      <w:r>
+        <w:rPr>
+          <w:rFonts w:ascii="Calibri" w:hAnsi="Calibri" w:cs="Calibri"/>
+        </w:rPr>
+        <w:t>END Quiz</w:t>
+      </w:r>
+    </w:p>
+    <w:p>
+      <w:pPr>
+        <w:rPr>
+          <w:rFonts w:ascii="Calibri" w:hAnsi="Calibri" w:cs="Calibri"/>
+        </w:rPr>
+      </w:pPr>
+    </w:p>
+    <w:p>
+      <w:pPr>
+        <w:pStyle w:val="Heading2"/>
+        <w:rPr>
+          <w:rFonts w:ascii="Calibri" w:hAnsi="Calibri" w:cs="Calibri"/>
+        </w:rPr>
+      </w:pPr>
+      <w:r>
+        <w:rPr>
+          <w:rFonts w:ascii="Calibri" w:hAnsi="Calibri" w:cs="Calibri"/>
+        </w:rPr>
+        <w:t xml:space="preserve">Single </w:t>
+      </w:r>
+      <w:r>
+        <w:rPr>
+          <w:rFonts w:ascii="Calibri" w:hAnsi="Calibri" w:cs="Calibri"/>
+        </w:rPr>
+        <w:t>Quiz</w:t>
+      </w:r>
+    </w:p>
+    <w:p>
+      <w:pPr>
+        <w:rPr>
+          <w:rFonts w:ascii="Calibri" w:hAnsi="Calibri" w:cs="Calibri"/>
+        </w:rPr>
+      </w:pPr>
+    </w:p>
+    <w:p>
+      <w:r>
+        <w:t>Simple Single-Select Quiz</w:t>
+      </w:r>
+    </w:p>
+    <w:p/>
+    <w:p>
+      <w:r>
+        <w:t>Quiz</w:t>
+      </w:r>
+    </w:p>
+    <w:p>
+      <w:proofErr w:type="gramStart"/>
+      <w:r>
+        <w:t>Question :</w:t>
+      </w:r>
+      <w:proofErr w:type="gramEnd"/>
+      <w:r>
+        <w:t>: Which expression correctly calculates vaccine effectiveness?</w:t>
+      </w:r>
+    </w:p>
+    <w:p>
+      <w:proofErr w:type="gramStart"/>
+      <w:r>
+        <w:t>Option :</w:t>
+      </w:r>
+      <w:proofErr w:type="gramEnd"/>
+      <w:r>
+        <w:t>: VE = (1 − RR) × 100</w:t>
+      </w:r>
+    </w:p>
+    <w:p>
+      <w:proofErr w:type="gramStart"/>
+      <w:r>
+        <w:t>Option :</w:t>
+      </w:r>
+      <w:proofErr w:type="gramEnd"/>
+      <w:r>
+        <w:t>: VE = RR × 100</w:t>
+      </w:r>
+    </w:p>
+    <w:p>
+      <w:proofErr w:type="gramStart"/>
+      <w:r>
+        <w:t>Option :</w:t>
+      </w:r>
+      <w:proofErr w:type="gramEnd"/>
+      <w:r>
+        <w:t>: VE = 100 − RR</w:t>
+      </w:r>
+    </w:p>
+    <w:p>
+      <w:proofErr w:type="gramStart"/>
+      <w:r>
+        <w:t>Answer :</w:t>
+      </w:r>
+      <w:proofErr w:type="gramEnd"/>
+      <w:r>
+        <w:t>: VE = (1 − RR) × 100</w:t>
+      </w:r>
+    </w:p>
+    <w:p>
+      <w:proofErr w:type="gramStart"/>
+      <w:r>
+        <w:t>Hint :</w:t>
+      </w:r>
+      <w:proofErr w:type="gramEnd"/>
+      <w:r>
+        <w:t>: Vaccine effectiveness measures the proportional reduction in risk.</w:t>
+      </w:r>
+    </w:p>
+    <w:p>
+      <w:proofErr w:type="gramStart"/>
+      <w:r>
+        <w:t>Explanation :</w:t>
+      </w:r>
+      <w:proofErr w:type="gramEnd"/>
+      <w:r>
+        <w:t>: The correct formula is VE = (1 − RR) × 100.</w:t>
+      </w:r>
+    </w:p>
+    <w:p>
+      <w:r>
+        <w:t>END Quiz</w:t>
+      </w:r>
+    </w:p>
+    <w:p>
+      <w:pPr>
+        <w:rPr>
+          <w:rFonts w:ascii="Calibri" w:hAnsi="Calibri" w:cs="Calibri"/>
+        </w:rPr>
+      </w:pPr>
+    </w:p>
+    <w:p>
+      <w:pPr>
+        <w:pStyle w:val="Heading2"/>
+        <w:rPr>
+          <w:rFonts w:ascii="Calibri" w:hAnsi="Calibri" w:cs="Calibri"/>
+        </w:rPr>
+      </w:pPr>
+      <w:r>
+        <w:rPr>
+          <w:rFonts w:ascii="Calibri" w:hAnsi="Calibri" w:cs="Calibri"/>
+        </w:rPr>
+        <w:t xml:space="preserve">Multiple </w:t>
+      </w:r>
+      <w:r>
+        <w:rPr>
+          <w:rFonts w:ascii="Calibri" w:hAnsi="Calibri" w:cs="Calibri"/>
+        </w:rPr>
+        <w:t>Quiz</w:t>
+      </w:r>
+    </w:p>
+    <w:p/>
+    <w:p>
+      <w:r>
+        <w:t>Quiz</w:t>
+      </w:r>
+    </w:p>
+    <w:p>
+      <w:proofErr w:type="gramStart"/>
+      <w:r>
+        <w:t>Type :</w:t>
+      </w:r>
+      <w:proofErr w:type="gramEnd"/>
+      <w:r>
+        <w:t>: multiple</w:t>
+      </w:r>
+    </w:p>
+    <w:p>
+      <w:proofErr w:type="gramStart"/>
+      <w:r>
+        <w:t>Question :</w:t>
+      </w:r>
+      <w:proofErr w:type="gramEnd"/>
+      <w:r>
+        <w:t>: Which R expressions would retain a patient whose systolic blood pressure is exactly 140 mmHg?</w:t>
+      </w:r>
+    </w:p>
+    <w:p/>
+    <w:p>
+      <w:r>
+        <w:t>Option</w:t>
+      </w:r>
+    </w:p>
+    <w:p>
+      <w:proofErr w:type="gramStart"/>
+      <w:r>
+        <w:t>Correct :</w:t>
+      </w:r>
+      <w:proofErr w:type="gramEnd"/>
+      <w:r>
+        <w:t>: yes</w:t>
+      </w:r>
+    </w:p>
+    <w:p/>
+    <w:p>
+      <w:r>
+        <w:t>R Example</w:t>
+      </w:r>
+    </w:p>
+    <w:p>
+      <w:r>
+        <w:t xml:space="preserve">R </w:t>
+      </w:r>
+      <w:proofErr w:type="gramStart"/>
+      <w:r>
+        <w:t>Mode :</w:t>
+      </w:r>
+      <w:proofErr w:type="gramEnd"/>
+      <w:r>
+        <w:t>: static</w:t>
+      </w:r>
+    </w:p>
+    <w:p>
+      <w:proofErr w:type="gramStart"/>
+      <w:r>
+        <w:t>Echo :</w:t>
+      </w:r>
+      <w:proofErr w:type="gramEnd"/>
+      <w:r>
+        <w:t>: true</w:t>
+      </w:r>
+    </w:p>
+    <w:p>
+      <w:proofErr w:type="gramStart"/>
+      <w:r>
+        <w:t>Output :</w:t>
+      </w:r>
+      <w:proofErr w:type="gramEnd"/>
+      <w:r>
+        <w:t>: false</w:t>
+      </w:r>
+    </w:p>
+    <w:p/>
+    <w:p>
+      <w:r>
+        <w:t>patients |&gt;</w:t>
+      </w:r>
+    </w:p>
+    <w:p>
+      <w:r>
+        <w:t xml:space="preserve">  </w:t>
+      </w:r>
+      <w:proofErr w:type="spellStart"/>
+      <w:proofErr w:type="gramStart"/>
+      <w:r>
+        <w:t>dplyr</w:t>
+      </w:r>
+      <w:proofErr w:type="spellEnd"/>
+      <w:r>
+        <w:t>::filter(</w:t>
+      </w:r>
+      <w:proofErr w:type="spellStart"/>
+      <w:proofErr w:type="gramEnd"/>
+      <w:r>
+        <w:t>systolic_bp</w:t>
+      </w:r>
+      <w:proofErr w:type="spellEnd"/>
+      <w:r>
+        <w:t xml:space="preserve"> &gt;= 140)</w:t>
+      </w:r>
+    </w:p>
+    <w:p/>
+    <w:p>
+      <w:r>
+        <w:t>END R Example</w:t>
+      </w:r>
+    </w:p>
+    <w:p/>
+    <w:p>
+      <w:proofErr w:type="gramStart"/>
+      <w:r>
+        <w:t>Feedback :</w:t>
+      </w:r>
+      <w:proofErr w:type="gramEnd"/>
+      <w:r>
+        <w:t>: Correct. The &gt;= operator includes 140.</w:t>
+      </w:r>
+    </w:p>
+    <w:p/>
+    <w:p>
+      <w:r>
+        <w:t>END Option</w:t>
+      </w:r>
+    </w:p>
+    <w:p/>
+    <w:p>
+      <w:r>
+        <w:t>Option</w:t>
+      </w:r>
+    </w:p>
+    <w:p>
+      <w:proofErr w:type="gramStart"/>
+      <w:r>
+        <w:t>Correct :</w:t>
+      </w:r>
+      <w:proofErr w:type="gramEnd"/>
+      <w:r>
+        <w:t>: yes</w:t>
+      </w:r>
+    </w:p>
+    <w:p/>
+    <w:p>
+      <w:r>
+        <w:t>R Example</w:t>
+      </w:r>
+    </w:p>
+    <w:p>
+      <w:r>
+        <w:t xml:space="preserve">R </w:t>
+      </w:r>
+      <w:proofErr w:type="gramStart"/>
+      <w:r>
+        <w:t>Mode :</w:t>
+      </w:r>
+      <w:proofErr w:type="gramEnd"/>
+      <w:r>
+        <w:t>: static</w:t>
+      </w:r>
+    </w:p>
+    <w:p>
+      <w:proofErr w:type="gramStart"/>
+      <w:r>
+        <w:t>Echo :</w:t>
+      </w:r>
+      <w:proofErr w:type="gramEnd"/>
+      <w:r>
+        <w:t>: true</w:t>
+      </w:r>
+    </w:p>
+    <w:p>
+      <w:proofErr w:type="gramStart"/>
+      <w:r>
+        <w:t>Output :</w:t>
+      </w:r>
+      <w:proofErr w:type="gramEnd"/>
+      <w:r>
+        <w:t>: false</w:t>
+      </w:r>
+    </w:p>
+    <w:p/>
+    <w:p>
+      <w:r>
+        <w:t>patients |&gt;</w:t>
+      </w:r>
+    </w:p>
+    <w:p>
+      <w:r>
+        <w:t xml:space="preserve">  </w:t>
+      </w:r>
+      <w:proofErr w:type="spellStart"/>
+      <w:proofErr w:type="gramStart"/>
+      <w:r>
+        <w:t>dplyr</w:t>
+      </w:r>
+      <w:proofErr w:type="spellEnd"/>
+      <w:r>
+        <w:t>::filter(</w:t>
+      </w:r>
+      <w:proofErr w:type="spellStart"/>
+      <w:proofErr w:type="gramEnd"/>
+      <w:r>
+        <w:t>systolic_bp</w:t>
+      </w:r>
+      <w:proofErr w:type="spellEnd"/>
+      <w:r>
+        <w:t xml:space="preserve"> == 140)</w:t>
+      </w:r>
+    </w:p>
+    <w:p/>
+    <w:p>
+      <w:r>
+        <w:t>END R Example</w:t>
+      </w:r>
+    </w:p>
+    <w:p/>
+    <w:p>
+      <w:proofErr w:type="gramStart"/>
+      <w:r>
+        <w:t>Feedback :</w:t>
+      </w:r>
+      <w:proofErr w:type="gramEnd"/>
+      <w:r>
+        <w:t>: Correct. The == operator selects readings that are exactly 140.</w:t>
+      </w:r>
+    </w:p>
+    <w:p/>
+    <w:p>
+      <w:r>
+        <w:t>END Option</w:t>
+      </w:r>
+    </w:p>
+    <w:p/>
+    <w:p>
+      <w:r>
+        <w:t>Option</w:t>
+      </w:r>
+    </w:p>
+    <w:p>
+      <w:proofErr w:type="gramStart"/>
+      <w:r>
+        <w:t>Correct :</w:t>
+      </w:r>
+      <w:proofErr w:type="gramEnd"/>
+      <w:r>
+        <w:t>: no</w:t>
+      </w:r>
+    </w:p>
+    <w:p/>
+    <w:p>
+      <w:r>
+        <w:t>R Example</w:t>
+      </w:r>
+    </w:p>
+    <w:p>
+      <w:r>
+        <w:t xml:space="preserve">R </w:t>
+      </w:r>
+      <w:proofErr w:type="gramStart"/>
+      <w:r>
+        <w:t>Mode :</w:t>
+      </w:r>
+      <w:proofErr w:type="gramEnd"/>
+      <w:r>
+        <w:t>: static</w:t>
+      </w:r>
+    </w:p>
+    <w:p>
+      <w:proofErr w:type="gramStart"/>
+      <w:r>
+        <w:t>Echo :</w:t>
+      </w:r>
+      <w:proofErr w:type="gramEnd"/>
+      <w:r>
+        <w:t>: true</w:t>
+      </w:r>
+    </w:p>
+    <w:p>
+      <w:proofErr w:type="gramStart"/>
+      <w:r>
+        <w:t>Output :</w:t>
+      </w:r>
+      <w:proofErr w:type="gramEnd"/>
+      <w:r>
+        <w:t>: false</w:t>
+      </w:r>
+    </w:p>
+    <w:p/>
+    <w:p>
+      <w:r>
+        <w:t>patients |&gt;</w:t>
+      </w:r>
+    </w:p>
+    <w:p>
+      <w:r>
+        <w:t xml:space="preserve">  </w:t>
+      </w:r>
+      <w:proofErr w:type="spellStart"/>
+      <w:proofErr w:type="gramStart"/>
+      <w:r>
+        <w:t>dplyr</w:t>
+      </w:r>
+      <w:proofErr w:type="spellEnd"/>
+      <w:r>
+        <w:t>::filter(</w:t>
+      </w:r>
+      <w:proofErr w:type="spellStart"/>
+      <w:proofErr w:type="gramEnd"/>
+      <w:r>
+        <w:t>systolic_bp</w:t>
+      </w:r>
+      <w:proofErr w:type="spellEnd"/>
+      <w:r>
+        <w:t xml:space="preserve"> &gt; 140)</w:t>
+      </w:r>
+    </w:p>
+    <w:p/>
+    <w:p>
+      <w:r>
+        <w:t>END R Example</w:t>
+      </w:r>
+    </w:p>
+    <w:p/>
+    <w:p>
+      <w:proofErr w:type="gramStart"/>
+      <w:r>
+        <w:t>Feedback :</w:t>
+      </w:r>
+      <w:proofErr w:type="gramEnd"/>
+      <w:r>
+        <w:t>: This excludes 140 because it only accepts values greater than 140.</w:t>
+      </w:r>
+    </w:p>
+    <w:p/>
+    <w:p>
+      <w:r>
+        <w:t>END Option</w:t>
+      </w:r>
+    </w:p>
+    <w:p/>
+    <w:p>
+      <w:r>
+        <w:t>Option</w:t>
+      </w:r>
+    </w:p>
+    <w:p>
+      <w:proofErr w:type="gramStart"/>
+      <w:r>
+        <w:t>Correct :</w:t>
+      </w:r>
+      <w:proofErr w:type="gramEnd"/>
+      <w:r>
+        <w:t>: no</w:t>
+      </w:r>
+    </w:p>
+    <w:p/>
+    <w:p>
+      <w:r>
+        <w:t>R Example</w:t>
+      </w:r>
+    </w:p>
+    <w:p>
+      <w:r>
+        <w:t xml:space="preserve">R </w:t>
+      </w:r>
+      <w:proofErr w:type="gramStart"/>
+      <w:r>
+        <w:t>Mode :</w:t>
+      </w:r>
+      <w:proofErr w:type="gramEnd"/>
+      <w:r>
+        <w:t>: static</w:t>
+      </w:r>
+    </w:p>
+    <w:p>
+      <w:proofErr w:type="gramStart"/>
+      <w:r>
+        <w:t>Echo :</w:t>
+      </w:r>
+      <w:proofErr w:type="gramEnd"/>
+      <w:r>
+        <w:t>: true</w:t>
+      </w:r>
+    </w:p>
+    <w:p>
+      <w:proofErr w:type="gramStart"/>
+      <w:r>
+        <w:t>Output :</w:t>
+      </w:r>
+      <w:proofErr w:type="gramEnd"/>
+      <w:r>
+        <w:t>: false</w:t>
+      </w:r>
+    </w:p>
+    <w:p/>
+    <w:p>
+      <w:r>
+        <w:t>patients |&gt;</w:t>
+      </w:r>
+    </w:p>
+    <w:p>
+      <w:r>
+        <w:t xml:space="preserve">  </w:t>
+      </w:r>
+      <w:proofErr w:type="spellStart"/>
+      <w:proofErr w:type="gramStart"/>
+      <w:r>
+        <w:t>dplyr</w:t>
+      </w:r>
+      <w:proofErr w:type="spellEnd"/>
+      <w:r>
+        <w:t>::filter(</w:t>
+      </w:r>
+      <w:proofErr w:type="spellStart"/>
+      <w:proofErr w:type="gramEnd"/>
+      <w:r>
+        <w:t>systolic_bp</w:t>
+      </w:r>
+      <w:proofErr w:type="spellEnd"/>
+      <w:r>
+        <w:t xml:space="preserve"> &lt; 140)</w:t>
+      </w:r>
+    </w:p>
+    <w:p/>
+    <w:p>
+      <w:r>
+        <w:t>END R Example</w:t>
+      </w:r>
+    </w:p>
+    <w:p/>
+    <w:p>
+      <w:proofErr w:type="gramStart"/>
+      <w:r>
+        <w:t>Feedback :</w:t>
+      </w:r>
+      <w:proofErr w:type="gramEnd"/>
+      <w:r>
+        <w:t>: This selects readings below 140.</w:t>
+      </w:r>
+    </w:p>
+    <w:p/>
+    <w:p>
+      <w:r>
+        <w:lastRenderedPageBreak/>
+        <w:t>END Option</w:t>
+      </w:r>
+    </w:p>
+    <w:p/>
+    <w:p>
+      <w:proofErr w:type="gramStart"/>
+      <w:r>
+        <w:t>Hint :</w:t>
+      </w:r>
+      <w:proofErr w:type="gramEnd"/>
+      <w:r>
+        <w:t>: More than one expression can include a reading of exactly 140.</w:t>
+      </w:r>
+    </w:p>
+    <w:p/>
+    <w:p>
+      <w:proofErr w:type="gramStart"/>
+      <w:r>
+        <w:t>Explanation :</w:t>
+      </w:r>
+      <w:proofErr w:type="gramEnd"/>
+      <w:r>
+        <w:t>: Both &gt;= 140 and == 140 retain a value of exactly 140.</w:t>
+      </w:r>
+    </w:p>
+    <w:p/>
+    <w:p>
+      <w:r>
+        <w:t>However, they have different meanings: &gt;= 140 also includes higher readings, while == 140 only includes readings equal to 140.</w:t>
+      </w:r>
+    </w:p>
+    <w:p/>
+    <w:p>
+      <w:r>
+        <w:t>END Quiz</w:t>
+      </w:r>
+      <w:r>
         <w:br/>
-        <w:t>Label :: Download full dataset</w:t>
-      </w:r>
-    </w:p>
-    <w:p>
-      <w:pPr>
-        <w:rPr>
-          <w:rFonts w:ascii="Calibri" w:hAnsi="Calibri" w:cs="Calibri"/>
-        </w:rPr>
-      </w:pPr>
-    </w:p>
-    <w:p>
-      <w:pPr>
-        <w:rPr>
-          <w:rFonts w:ascii="Calibri" w:hAnsi="Calibri" w:cs="Calibri"/>
-        </w:rPr>
-      </w:pPr>
-    </w:p>
+      </w:r>
+    </w:p>
+    <w:p/>
     <w:p>
       <w:pPr>
         <w:pStyle w:val="Heading2"/>
@@ -3440,181 +6058,6 @@
         <w:rPr>
           <w:rFonts w:ascii="Calibri" w:hAnsi="Calibri" w:cs="Calibri"/>
         </w:rPr>
-        <w:t>Quiz</w:t>
-      </w:r>
-    </w:p>
-    <w:p>
-      <w:pPr>
-        <w:rPr>
-          <w:rFonts w:ascii="Calibri" w:hAnsi="Calibri" w:cs="Calibri"/>
-        </w:rPr>
-      </w:pPr>
-      <w:r>
-        <w:rPr>
-          <w:rFonts w:ascii="Calibri" w:hAnsi="Calibri" w:cs="Calibri"/>
-        </w:rPr>
-        <w:br/>
-      </w:r>
-      <w:proofErr w:type="gramStart"/>
-      <w:r>
-        <w:rPr>
-          <w:rFonts w:ascii="Calibri" w:hAnsi="Calibri" w:cs="Calibri"/>
-        </w:rPr>
-        <w:t>Question :</w:t>
-      </w:r>
-      <w:proofErr w:type="gramEnd"/>
-      <w:r>
-        <w:rPr>
-          <w:rFonts w:ascii="Calibri" w:hAnsi="Calibri" w:cs="Calibri"/>
-        </w:rPr>
-        <w:t>: Based on the outbreak data, what does a vaccine effectiveness of 80% mean in practice?</w:t>
-      </w:r>
-    </w:p>
-    <w:p>
-      <w:pPr>
-        <w:rPr>
-          <w:rFonts w:ascii="Calibri" w:hAnsi="Calibri" w:cs="Calibri"/>
-        </w:rPr>
-      </w:pPr>
-      <w:proofErr w:type="gramStart"/>
-      <w:r>
-        <w:rPr>
-          <w:rFonts w:ascii="Calibri" w:hAnsi="Calibri" w:cs="Calibri"/>
-        </w:rPr>
-        <w:t>Option :</w:t>
-      </w:r>
-      <w:proofErr w:type="gramEnd"/>
-      <w:r>
-        <w:rPr>
-          <w:rFonts w:ascii="Calibri" w:hAnsi="Calibri" w:cs="Calibri"/>
-        </w:rPr>
-        <w:t>: Vaccinated individuals have zero risk of infection</w:t>
-      </w:r>
-    </w:p>
-    <w:p>
-      <w:pPr>
-        <w:rPr>
-          <w:rFonts w:ascii="Calibri" w:hAnsi="Calibri" w:cs="Calibri"/>
-        </w:rPr>
-      </w:pPr>
-      <w:proofErr w:type="gramStart"/>
-      <w:r>
-        <w:rPr>
-          <w:rFonts w:ascii="Calibri" w:hAnsi="Calibri" w:cs="Calibri"/>
-        </w:rPr>
-        <w:t>Option :</w:t>
-      </w:r>
-      <w:proofErr w:type="gramEnd"/>
-      <w:r>
-        <w:rPr>
-          <w:rFonts w:ascii="Calibri" w:hAnsi="Calibri" w:cs="Calibri"/>
-        </w:rPr>
-        <w:t>: Vaccinated individuals have an 80% lower risk of infection than unvaccinated individuals</w:t>
-      </w:r>
-    </w:p>
-    <w:p>
-      <w:pPr>
-        <w:rPr>
-          <w:rFonts w:ascii="Calibri" w:hAnsi="Calibri" w:cs="Calibri"/>
-        </w:rPr>
-      </w:pPr>
-      <w:proofErr w:type="gramStart"/>
-      <w:r>
-        <w:rPr>
-          <w:rFonts w:ascii="Calibri" w:hAnsi="Calibri" w:cs="Calibri"/>
-        </w:rPr>
-        <w:t>Option :</w:t>
-      </w:r>
-      <w:proofErr w:type="gramEnd"/>
-      <w:r>
-        <w:rPr>
-          <w:rFonts w:ascii="Calibri" w:hAnsi="Calibri" w:cs="Calibri"/>
-        </w:rPr>
-        <w:t>: 80% of vaccinated individuals will not become infected</w:t>
-      </w:r>
-    </w:p>
-    <w:p>
-      <w:pPr>
-        <w:rPr>
-          <w:rFonts w:ascii="Calibri" w:hAnsi="Calibri" w:cs="Calibri"/>
-        </w:rPr>
-      </w:pPr>
-      <w:proofErr w:type="gramStart"/>
-      <w:r>
-        <w:rPr>
-          <w:rFonts w:ascii="Calibri" w:hAnsi="Calibri" w:cs="Calibri"/>
-        </w:rPr>
-        <w:t>Option :</w:t>
-      </w:r>
-      <w:proofErr w:type="gramEnd"/>
-      <w:r>
-        <w:rPr>
-          <w:rFonts w:ascii="Calibri" w:hAnsi="Calibri" w:cs="Calibri"/>
-        </w:rPr>
-        <w:t>: The vaccine prevents 80 cases in every outbreak regardless of context</w:t>
-      </w:r>
-    </w:p>
-    <w:p>
-      <w:pPr>
-        <w:rPr>
-          <w:rFonts w:ascii="Calibri" w:hAnsi="Calibri" w:cs="Calibri"/>
-        </w:rPr>
-      </w:pPr>
-      <w:proofErr w:type="gramStart"/>
-      <w:r>
-        <w:rPr>
-          <w:rFonts w:ascii="Calibri" w:hAnsi="Calibri" w:cs="Calibri"/>
-        </w:rPr>
-        <w:t>Answer :</w:t>
-      </w:r>
-      <w:proofErr w:type="gramEnd"/>
-      <w:r>
-        <w:rPr>
-          <w:rFonts w:ascii="Calibri" w:hAnsi="Calibri" w:cs="Calibri"/>
-        </w:rPr>
-        <w:t>: Vaccinated individuals have an 80% lower risk of infection than unvaccinated individuals</w:t>
-      </w:r>
-    </w:p>
-    <w:p>
-      <w:pPr>
-        <w:rPr>
-          <w:rFonts w:ascii="Calibri" w:hAnsi="Calibri" w:cs="Calibri"/>
-        </w:rPr>
-      </w:pPr>
-      <w:proofErr w:type="gramStart"/>
-      <w:r>
-        <w:rPr>
-          <w:rFonts w:ascii="Calibri" w:hAnsi="Calibri" w:cs="Calibri"/>
-        </w:rPr>
-        <w:t>Explanation :</w:t>
-      </w:r>
-      <w:proofErr w:type="gramEnd"/>
-      <w:r>
-        <w:rPr>
-          <w:rFonts w:ascii="Calibri" w:hAnsi="Calibri" w:cs="Calibri"/>
-        </w:rPr>
-        <w:t>: Vaccine effectiveness compares the risk of disease in vaccinated and unvaccinated groups under real-world conditions. An 80% VE means the vaccinated group experienced substantially lower risk, not that infection risk was eliminated entirely.</w:t>
-      </w:r>
-    </w:p>
-    <w:p>
-      <w:pPr>
-        <w:pStyle w:val="Heading2"/>
-        <w:rPr>
-          <w:rFonts w:ascii="Calibri" w:hAnsi="Calibri" w:cs="Calibri"/>
-        </w:rPr>
-      </w:pPr>
-    </w:p>
-    <w:p>
-      <w:pPr>
-        <w:pStyle w:val="Heading2"/>
-        <w:rPr>
-          <w:rFonts w:ascii="Calibri" w:hAnsi="Calibri" w:cs="Calibri"/>
-        </w:rPr>
-      </w:pPr>
-      <w:r>
-        <w:rPr>
-          <w:rFonts w:ascii="Calibri" w:hAnsi="Calibri" w:cs="Calibri"/>
-        </w:rPr>
         <w:t>Key Takeaway</w:t>
       </w:r>
     </w:p>
@@ -3631,27 +6074,18 @@
           <w:rFonts w:ascii="Calibri" w:hAnsi="Calibri" w:cs="Calibri"/>
         </w:rPr>
       </w:pPr>
-      <w:proofErr w:type="gramStart"/>
-      <w:r>
-        <w:rPr>
-          <w:rFonts w:ascii="Calibri" w:hAnsi="Calibri" w:cs="Calibri"/>
-        </w:rPr>
-        <w:lastRenderedPageBreak/>
-        <w:t>Callout :</w:t>
-      </w:r>
-      <w:proofErr w:type="gramEnd"/>
-      <w:r>
-        <w:rPr>
-          <w:rFonts w:ascii="Calibri" w:hAnsi="Calibri" w:cs="Calibri"/>
-        </w:rPr>
-        <w:t>: tip</w:t>
-      </w:r>
-      <w:r>
-        <w:rPr>
-          <w:rFonts w:ascii="Calibri" w:hAnsi="Calibri" w:cs="Calibri"/>
-        </w:rPr>
-        <w:br/>
-        <w:t>Text :: Vaccination significantly reduces the likelihood of infection and severe disease, even if it does not eliminate risk entirely.</w:t>
+      <w:r>
+        <w:t>Callout :: tip</w:t>
+      </w:r>
+    </w:p>
+    <w:p>
+      <w:r>
+        <w:t>Vaccination significantly reduces the likelihood of infection and severe disease, even if it does not eliminate risk entirely.</w:t>
+      </w:r>
+    </w:p>
+    <w:p>
+      <w:r>
+        <w:t>END Callout</w:t>
       </w:r>
     </w:p>
     <w:p>
@@ -3976,21 +6410,49 @@
         <w:rPr>
           <w:rFonts w:ascii="Calibri" w:hAnsi="Calibri" w:cs="Calibri"/>
         </w:rPr>
-        <w:t>{n}{x}</w:t>
+        <w:t>{n}{</w:t>
+      </w:r>
+      <w:proofErr w:type="gramStart"/>
+      <w:r>
+        <w:rPr>
+          <w:rFonts w:ascii="Calibri" w:hAnsi="Calibri" w:cs="Calibri"/>
+        </w:rPr>
+        <w:t>x}</w:t>
       </w:r>
       <w:proofErr w:type="spellStart"/>
       <w:r>
         <w:rPr>
           <w:rFonts w:ascii="Calibri" w:hAnsi="Calibri" w:cs="Calibri"/>
         </w:rPr>
-        <w:t>p^x</w:t>
+        <w:t>p</w:t>
+      </w:r>
+      <w:proofErr w:type="gramEnd"/>
+      <w:r>
+        <w:rPr>
+          <w:rFonts w:ascii="Calibri" w:hAnsi="Calibri" w:cs="Calibri"/>
+        </w:rPr>
+        <w:t>^x</w:t>
       </w:r>
       <w:proofErr w:type="spellEnd"/>
       <w:r>
         <w:rPr>
           <w:rFonts w:ascii="Calibri" w:hAnsi="Calibri" w:cs="Calibri"/>
         </w:rPr>
-        <w:t>(1-p)^{n-x}</w:t>
+        <w:t>(1-</w:t>
+      </w:r>
+      <w:proofErr w:type="gramStart"/>
+      <w:r>
+        <w:rPr>
+          <w:rFonts w:ascii="Calibri" w:hAnsi="Calibri" w:cs="Calibri"/>
+        </w:rPr>
+        <w:t>p)^</w:t>
+      </w:r>
+      <w:proofErr w:type="gramEnd"/>
+      <w:r>
+        <w:rPr>
+          <w:rFonts w:ascii="Calibri" w:hAnsi="Calibri" w:cs="Calibri"/>
+        </w:rPr>
+        <w:t>{n-x}</w:t>
       </w:r>
       <w:r>
         <w:rPr>
@@ -4098,7 +6560,7 @@
 </file>
 
 <file path=word/numbering.xml><?xml version="1.0" encoding="utf-8"?>
-<w:numbering xmlns:wpc="http://schemas.microsoft.com/office/word/2010/wordprocessingCanvas" xmlns:cx="http://schemas.microsoft.com/office/drawing/2014/chartex" xmlns:cx1="http://schemas.microsoft.com/office/drawing/2015/9/8/chartex" xmlns:cx2="http://schemas.microsoft.com/office/drawing/2015/10/21/chartex" xmlns:cx3="http://schemas.microsoft.com/office/drawing/2016/5/9/chartex" xmlns:cx4="http://schemas.microsoft.com/office/drawing/2016/5/10/chartex" xmlns:cx5="http://schemas.microsoft.com/office/drawing/2016/5/11/chartex" xmlns:cx6="http://schemas.microsoft.com/office/drawing/2016/5/12/chartex" xmlns:cx7="http://schemas.microsoft.com/office/drawing/2016/5/13/chartex" xmlns:cx8="http://schemas.microsoft.com/office/drawing/2016/5/14/chartex" xmlns:mc="http://schemas.openxmlformats.org/markup-compatibility/2006" xmlns:aink="http://schemas.microsoft.com/office/drawing/2016/ink" xmlns:am3d="http://schemas.microsoft.com/office/drawing/2017/model3d" xmlns:o="urn:schemas-microsoft-com:office:office" xmlns:oel="http://schemas.microsoft.com/office/2019/extlst" xmlns:r="http://schemas.openxmlformats.org/officeDocument/2006/relationships" xmlns:m="http://schemas.openxmlformats.org/officeDocument/2006/math" xmlns:v="urn:schemas-microsoft-com:vml" xmlns:wp14="http://schemas.microsoft.com/office/word/2010/wordprocessingDrawing" xmlns:wp="http://schemas.openxmlformats.org/drawingml/2006/wordprocessingDrawing" xmlns:w10="urn:schemas-microsoft-com:office:word" xmlns:w="http://schemas.openxmlformats.org/wordprocessingml/2006/main" xmlns:w14="http://schemas.microsoft.com/office/word/2010/wordml" xmlns:w15="http://schemas.microsoft.com/office/word/2012/wordml" xmlns:w16cex="http://schemas.microsoft.com/office/word/2018/wordml/cex" xmlns:w16cid="http://schemas.microsoft.com/office/word/2016/wordml/cid" xmlns:w16="http://schemas.microsoft.com/office/word/2018/wordml" xmlns:w16du="http://schemas.microsoft.com/office/word/2023/wordml/word16du" xmlns:w16sdtdh="http://schemas.microsoft.com/office/word/2020/wordml/sdtdatahash" xmlns:w16se="http://schemas.microsoft.com/office/word/2015/wordml/symex" xmlns:wpg="http://schemas.microsoft.com/office/word/2010/wordprocessingGroup" xmlns:wpi="http://schemas.microsoft.com/office/word/2010/wordprocessingInk" xmlns:wne="http://schemas.microsoft.com/office/word/2006/wordml" xmlns:wps="http://schemas.microsoft.com/office/word/2010/wordprocessingShape" mc:Ignorable="w14 w15 w16se w16cid w16 w16cex w16sdtdh w16du wp14">
+<w:numbering xmlns:wpc="http://schemas.microsoft.com/office/word/2010/wordprocessingCanvas" xmlns:cx="http://schemas.microsoft.com/office/drawing/2014/chartex" xmlns:cx1="http://schemas.microsoft.com/office/drawing/2015/9/8/chartex" xmlns:cx2="http://schemas.microsoft.com/office/drawing/2015/10/21/chartex" xmlns:cx3="http://schemas.microsoft.com/office/drawing/2016/5/9/chartex" xmlns:cx4="http://schemas.microsoft.com/office/drawing/2016/5/10/chartex" xmlns:cx5="http://schemas.microsoft.com/office/drawing/2016/5/11/chartex" xmlns:cx6="http://schemas.microsoft.com/office/drawing/2016/5/12/chartex" xmlns:cx7="http://schemas.microsoft.com/office/drawing/2016/5/13/chartex" xmlns:cx8="http://schemas.microsoft.com/office/drawing/2016/5/14/chartex" xmlns:mc="http://schemas.openxmlformats.org/markup-compatibility/2006" xmlns:m="http://schemas.openxmlformats.org/officeDocument/2006/math" xmlns:aink="http://schemas.microsoft.com/office/drawing/2016/ink" xmlns:am3d="http://schemas.microsoft.com/office/drawing/2017/model3d" xmlns:oel="http://schemas.microsoft.com/office/2019/extlst" xmlns:r="http://schemas.openxmlformats.org/officeDocument/2006/relationships" xmlns:wp14="http://schemas.microsoft.com/office/word/2010/wordprocessingDrawing" xmlns:wp="http://schemas.openxmlformats.org/drawingml/2006/wordprocessingDrawing" xmlns:wpg="http://schemas.microsoft.com/office/word/2010/wordprocessingGroup" xmlns:wpi="http://schemas.microsoft.com/office/word/2010/wordprocessingInk" xmlns:wps="http://schemas.microsoft.com/office/word/2010/wordprocessingShape" xmlns:o="urn:schemas-microsoft-com:office:office" xmlns:v="urn:schemas-microsoft-com:vml" xmlns:w10="urn:schemas-microsoft-com:office:word" xmlns:w="http://schemas.openxmlformats.org/wordprocessingml/2006/main" xmlns:w14="http://schemas.microsoft.com/office/word/2010/wordml" xmlns:w15="http://schemas.microsoft.com/office/word/2012/wordml" xmlns:w16cei="http://schemas.microsoft.com/office/word/2026/wordml/cei" xmlns:w16cex="http://schemas.microsoft.com/office/word/2018/wordml/cex" xmlns:w16cid="http://schemas.microsoft.com/office/word/2016/wordml/cid" xmlns:w16="http://schemas.microsoft.com/office/word/2018/wordml" xmlns:w16sdtdh="http://schemas.microsoft.com/office/word/2020/wordml/sdtdatahash" xmlns:w16sdtfl="http://schemas.microsoft.com/office/word/2024/wordml/sdtformatlock" xmlns:w16se="http://schemas.microsoft.com/office/word/2015/wordml/symex" xmlns:w16du="http://schemas.microsoft.com/office/word/2023/wordml/word16du" xmlns:wne="http://schemas.microsoft.com/office/word/2006/wordml" mc:Ignorable="w14 w15 w16se w16cid w16 w16cex w16sdtdh w16sdtfl w16du wp14">
   <w:abstractNum w:abstractNumId="0" w15:restartNumberingAfterBreak="0">
     <w:nsid w:val="135B3991"/>
     <w:multiLevelType w:val="multilevel"/>
@@ -4696,6 +7158,23 @@
     </w:lvl>
   </w:abstractNum>
   <w:abstractNum w:abstractNumId="4" w15:restartNumberingAfterBreak="0">
+    <w:nsid w:val="33004A61"/>
+    <w:multiLevelType w:val="singleLevel"/>
+    <w:tmpl w:val="0809000F"/>
+    <w:lvl w:ilvl="0">
+      <w:start w:val="1"/>
+      <w:numFmt w:val="decimal"/>
+      <w:lvlText w:val="%1."/>
+      <w:lvlJc w:val="left"/>
+      <w:pPr>
+        <w:tabs>
+          <w:tab w:val="num" w:pos="720"/>
+        </w:tabs>
+        <w:ind w:left="720" w:hanging="360"/>
+      </w:pPr>
+    </w:lvl>
+  </w:abstractNum>
+  <w:abstractNum w:abstractNumId="5" w15:restartNumberingAfterBreak="0">
     <w:nsid w:val="332543AF"/>
     <w:multiLevelType w:val="multilevel"/>
     <w:tmpl w:val="88D4B8E4"/>
@@ -4844,7 +7323,7 @@
       </w:rPr>
     </w:lvl>
   </w:abstractNum>
-  <w:abstractNum w:abstractNumId="5" w15:restartNumberingAfterBreak="0">
+  <w:abstractNum w:abstractNumId="6" w15:restartNumberingAfterBreak="0">
     <w:nsid w:val="584941C2"/>
     <w:multiLevelType w:val="multilevel"/>
     <w:tmpl w:val="CF300A84"/>
@@ -4993,29 +7472,190 @@
       </w:rPr>
     </w:lvl>
   </w:abstractNum>
-  <w:num w:numId="1" w16cid:durableId="1433629160">
-    <w:abstractNumId w:val="1"/>
-  </w:num>
-  <w:num w:numId="2" w16cid:durableId="1212494992">
+  <w:abstractNum w:abstractNumId="7" w15:restartNumberingAfterBreak="0">
+    <w:nsid w:val="728356C3"/>
+    <w:multiLevelType w:val="multilevel"/>
+    <w:tmpl w:val="8DE871D8"/>
+    <w:lvl w:ilvl="0">
+      <w:start w:val="1"/>
+      <w:numFmt w:val="decimal"/>
+      <w:lvlText w:val="%1."/>
+      <w:lvlJc w:val="left"/>
+      <w:pPr>
+        <w:tabs>
+          <w:tab w:val="num" w:pos="720"/>
+        </w:tabs>
+        <w:ind w:left="720" w:hanging="720"/>
+      </w:pPr>
+    </w:lvl>
+    <w:lvl w:ilvl="1">
+      <w:start w:val="1"/>
+      <w:numFmt w:val="decimal"/>
+      <w:lvlText w:val="%2."/>
+      <w:lvlJc w:val="left"/>
+      <w:pPr>
+        <w:tabs>
+          <w:tab w:val="num" w:pos="1440"/>
+        </w:tabs>
+        <w:ind w:left="1440" w:hanging="720"/>
+      </w:pPr>
+    </w:lvl>
+    <w:lvl w:ilvl="2">
+      <w:start w:val="1"/>
+      <w:numFmt w:val="decimal"/>
+      <w:lvlText w:val="%3."/>
+      <w:lvlJc w:val="left"/>
+      <w:pPr>
+        <w:tabs>
+          <w:tab w:val="num" w:pos="2160"/>
+        </w:tabs>
+        <w:ind w:left="2160" w:hanging="720"/>
+      </w:pPr>
+    </w:lvl>
+    <w:lvl w:ilvl="3">
+      <w:start w:val="1"/>
+      <w:numFmt w:val="decimal"/>
+      <w:lvlText w:val="%4."/>
+      <w:lvlJc w:val="left"/>
+      <w:pPr>
+        <w:tabs>
+          <w:tab w:val="num" w:pos="2880"/>
+        </w:tabs>
+        <w:ind w:left="2880" w:hanging="720"/>
+      </w:pPr>
+    </w:lvl>
+    <w:lvl w:ilvl="4">
+      <w:start w:val="1"/>
+      <w:numFmt w:val="decimal"/>
+      <w:lvlText w:val="%5."/>
+      <w:lvlJc w:val="left"/>
+      <w:pPr>
+        <w:tabs>
+          <w:tab w:val="num" w:pos="3600"/>
+        </w:tabs>
+        <w:ind w:left="3600" w:hanging="720"/>
+      </w:pPr>
+    </w:lvl>
+    <w:lvl w:ilvl="5">
+      <w:start w:val="1"/>
+      <w:numFmt w:val="decimal"/>
+      <w:lvlText w:val="%6."/>
+      <w:lvlJc w:val="left"/>
+      <w:pPr>
+        <w:tabs>
+          <w:tab w:val="num" w:pos="4320"/>
+        </w:tabs>
+        <w:ind w:left="4320" w:hanging="720"/>
+      </w:pPr>
+    </w:lvl>
+    <w:lvl w:ilvl="6">
+      <w:start w:val="1"/>
+      <w:numFmt w:val="decimal"/>
+      <w:lvlText w:val="%7."/>
+      <w:lvlJc w:val="left"/>
+      <w:pPr>
+        <w:tabs>
+          <w:tab w:val="num" w:pos="5040"/>
+        </w:tabs>
+        <w:ind w:left="5040" w:hanging="720"/>
+      </w:pPr>
+    </w:lvl>
+    <w:lvl w:ilvl="7">
+      <w:start w:val="1"/>
+      <w:numFmt w:val="decimal"/>
+      <w:lvlText w:val="%8."/>
+      <w:lvlJc w:val="left"/>
+      <w:pPr>
+        <w:tabs>
+          <w:tab w:val="num" w:pos="5760"/>
+        </w:tabs>
+        <w:ind w:left="5760" w:hanging="720"/>
+      </w:pPr>
+    </w:lvl>
+    <w:lvl w:ilvl="8">
+      <w:start w:val="1"/>
+      <w:numFmt w:val="decimal"/>
+      <w:lvlText w:val="%9."/>
+      <w:lvlJc w:val="left"/>
+      <w:pPr>
+        <w:tabs>
+          <w:tab w:val="num" w:pos="6480"/>
+        </w:tabs>
+        <w:ind w:left="6480" w:hanging="720"/>
+      </w:pPr>
+    </w:lvl>
+  </w:abstractNum>
+  <w:num w:numId="1" w16cid:durableId="1197229982">
     <w:abstractNumId w:val="4"/>
   </w:num>
-  <w:num w:numId="3" w16cid:durableId="741028037">
-    <w:abstractNumId w:val="2"/>
+  <w:num w:numId="2" w16cid:durableId="1701125592">
+    <w:abstractNumId w:val="7"/>
   </w:num>
-  <w:num w:numId="4" w16cid:durableId="969435854">
-    <w:abstractNumId w:val="0"/>
+  <w:num w:numId="3" w16cid:durableId="777413349">
+    <w:abstractNumId w:val="7"/>
+    <w:lvlOverride w:ilvl="0">
+      <w:startOverride w:val="1"/>
+    </w:lvlOverride>
+    <w:lvlOverride w:ilvl="1">
+      <w:startOverride w:val="1"/>
+    </w:lvlOverride>
+    <w:lvlOverride w:ilvl="2">
+      <w:startOverride w:val="1"/>
+    </w:lvlOverride>
+    <w:lvlOverride w:ilvl="3">
+      <w:startOverride w:val="1"/>
+    </w:lvlOverride>
+    <w:lvlOverride w:ilvl="4">
+      <w:startOverride w:val="1"/>
+    </w:lvlOverride>
+    <w:lvlOverride w:ilvl="5">
+      <w:startOverride w:val="1"/>
+    </w:lvlOverride>
+    <w:lvlOverride w:ilvl="6">
+      <w:startOverride w:val="1"/>
+    </w:lvlOverride>
+    <w:lvlOverride w:ilvl="7">
+      <w:startOverride w:val="1"/>
+    </w:lvlOverride>
+    <w:lvlOverride w:ilvl="8">
+      <w:startOverride w:val="1"/>
+    </w:lvlOverride>
   </w:num>
-  <w:num w:numId="5" w16cid:durableId="646478414">
-    <w:abstractNumId w:val="3"/>
-  </w:num>
-  <w:num w:numId="6" w16cid:durableId="1720787793">
-    <w:abstractNumId w:val="5"/>
+  <w:num w:numId="4" w16cid:durableId="604576868">
+    <w:abstractNumId w:val="7"/>
+    <w:lvlOverride w:ilvl="0">
+      <w:startOverride w:val="1"/>
+    </w:lvlOverride>
+    <w:lvlOverride w:ilvl="1">
+      <w:startOverride w:val="1"/>
+    </w:lvlOverride>
+    <w:lvlOverride w:ilvl="2">
+      <w:startOverride w:val="1"/>
+    </w:lvlOverride>
+    <w:lvlOverride w:ilvl="3">
+      <w:startOverride w:val="1"/>
+    </w:lvlOverride>
+    <w:lvlOverride w:ilvl="4">
+      <w:startOverride w:val="1"/>
+    </w:lvlOverride>
+    <w:lvlOverride w:ilvl="5">
+      <w:startOverride w:val="1"/>
+    </w:lvlOverride>
+    <w:lvlOverride w:ilvl="6">
+      <w:startOverride w:val="1"/>
+    </w:lvlOverride>
+    <w:lvlOverride w:ilvl="7">
+      <w:startOverride w:val="1"/>
+    </w:lvlOverride>
+    <w:lvlOverride w:ilvl="8">
+      <w:startOverride w:val="1"/>
+    </w:lvlOverride>
   </w:num>
 </w:numbering>
 </file>
 
 <file path=word/styles.xml><?xml version="1.0" encoding="utf-8"?>
-<w:styles xmlns:mc="http://schemas.openxmlformats.org/markup-compatibility/2006" xmlns:r="http://schemas.openxmlformats.org/officeDocument/2006/relationships" xmlns:w="http://schemas.openxmlformats.org/wordprocessingml/2006/main" xmlns:w14="http://schemas.microsoft.com/office/word/2010/wordml" xmlns:w15="http://schemas.microsoft.com/office/word/2012/wordml" xmlns:w16cex="http://schemas.microsoft.com/office/word/2018/wordml/cex" xmlns:w16cid="http://schemas.microsoft.com/office/word/2016/wordml/cid" xmlns:w16="http://schemas.microsoft.com/office/word/2018/wordml" xmlns:w16du="http://schemas.microsoft.com/office/word/2023/wordml/word16du" xmlns:w16sdtdh="http://schemas.microsoft.com/office/word/2020/wordml/sdtdatahash" xmlns:w16se="http://schemas.microsoft.com/office/word/2015/wordml/symex" mc:Ignorable="w14 w15 w16se w16cid w16 w16cex w16sdtdh w16du">
+<w:styles xmlns:mc="http://schemas.openxmlformats.org/markup-compatibility/2006" xmlns:r="http://schemas.openxmlformats.org/officeDocument/2006/relationships" xmlns:w="http://schemas.openxmlformats.org/wordprocessingml/2006/main" xmlns:w14="http://schemas.microsoft.com/office/word/2010/wordml" xmlns:w15="http://schemas.microsoft.com/office/word/2012/wordml" xmlns:w16cex="http://schemas.microsoft.com/office/word/2018/wordml/cex" xmlns:w16cid="http://schemas.microsoft.com/office/word/2016/wordml/cid" xmlns:w16="http://schemas.microsoft.com/office/word/2018/wordml" xmlns:w16sdtdh="http://schemas.microsoft.com/office/word/2020/wordml/sdtdatahash" xmlns:w16sdtfl="http://schemas.microsoft.com/office/word/2024/wordml/sdtformatlock" xmlns:w16se="http://schemas.microsoft.com/office/word/2015/wordml/symex" xmlns:w16du="http://schemas.microsoft.com/office/word/2023/wordml/word16du" mc:Ignorable="w14 w15 w16se w16cid w16 w16cex w16sdtdh w16sdtfl w16du">
   <w:docDefaults>
     <w:rPrDefault>
       <w:rPr>
@@ -5617,6 +8257,7 @@
   <w:style w:type="character" w:default="1" w:styleId="DefaultParagraphFont">
     <w:name w:val="Default Paragraph Font"/>
     <w:uiPriority w:val="1"/>
+    <w:semiHidden/>
     <w:unhideWhenUsed/>
   </w:style>
   <w:style w:type="table" w:default="1" w:styleId="TableNormal">

</xml_diff>